<commit_message>
Paper: replace the 10% lock threshold with the converged result
The enstrophy-based lock threshold is not grid-converged (hydrodynamic
mixing-layer enstrophy grows 9.7 -> 23.9 -> 61.6 over 1x/2x/4x), so the
abstract, Sections 3.5, 4.3, 4.6, 5.2, 5.3, the Fig. 7 caption and the
conclusion now state the converged result: interface roughness converges
and the stripe-scale deformation follows a8 = kappa dP_B with kappa =
0.0176, 0.0250, 0.0270 (Richardson ~0.028, order 1.9). New Fig. 13 and
Table 2 (three-resolution data); short paragraph on the 3D runs (no
tearing at S ~ 75). README no longer flags the paper as outdated.

Co-Authored-By: Claude Opus 5.5 <noreply@anthropic.com>
</commit_message>
<xml_diff>
--- a/paper/magnetic_sieve.docx
+++ b/paper/magnetic_sieve.docx
@@ -63,7 +63,22 @@
           <w:b w:val="0"/>
           <w:i w:val="0"/>
         </w:rPr>
-        <w:t>We examine whether a spatially striped magnetic field can suppress the Richtmyer-Meshkov instability (RMI) of a shocked density interface while channelling the post-shock flow through the weak-field gaps between the stripes, a configuration we refer to as a magnetic sieve. The study uses a two-dimensional, GPU-based finite-volume MHD solver with an HLLD Riemann solver, MUSCL reconstruction, SSP-RK3 time integration and GLM divergence cleaning. An audit of the first implementation found a non-solenoidal initial field, an upstream state that was not in pressure balance, a resistive energy source that created energy, and an energy diagnostic that confused boundary inflow with conservation error. After correction, the discrete energy budget closes to round-off, and initial states are restricted to the fast-shock regime, which for a shock-parallel field at Mach 10 requires B₀ &lt; 6.55√p̅. A uniform shock-parallel field of strength B ≥ 2 reduces the mixing-layer enstrophy to 0.03 of the hydrodynamic value. Striped fields meet the same criterion only when the bar-to-gap field contrast is about 10% or less. Larger contrast produces a steady, field-aligned shear behind the shock, because the shock compresses the gas but not a shock-parallel field; magnetic tension does not oppose this shear, and it deforms the interface at the stripe scale. The contrast needed to steer flow into the gaps therefore prevents suppression. When the stripe wavenumber is half the interface wavenumber, the stripe-induced displacement interferes with the RMI mode with the phase dependence predicted from the jump conditions, producing a zero crossing of the mode followed by inverted growth rather than a sustained lock. This zero crossing is the magnetic counterpart of the phase-dependent interaction between non-uniform shocks and interface perturbations known from hydrodynamic studies; we report it as an observation.</w:t>
+        <w:t>We examine whether a spatially striped magnetic field can suppress the Richtmyer-Meshkov instability (RMI) of a shocked density interface while channelling the post-shock flow through the weak-field gaps between the stripes, a configuration we refer to as a magnetic sieve. The study uses a GPU-based finite-volume MHD solver in two and three dimensions with an HLLD Riemann solver, MUSCL reconstruction, SSP-RK3 time integration and GLM divergence cleaning. An audit of the first implementation found a non-solenoidal initial field, an upstream state that was not in pressure balance, a resistive energy source that created energy, and an energy diagnostic that confused boundary inflow with conservation error. After correction, the discrete energy budget closes to round-off, and initial states are restricted to the fast-shock regime, which for a shock-parallel field at Mach 10 requires B₀ &lt; 6.55√p̅. A uniform shock-parallel field suppresses the instability. Striped fields leave the interface rougher than a uniform field: a grid-convergence study at three resolutions shows that the stripe-scale deformation grows linearly with the bar-gap magnetic-pressure contrast, a₈ ≈ κΔP</w:t>
+      </w:r>
+      <w:r>
+        <w:rPr>
+          <w:b w:val="0"/>
+          <w:i w:val="0"/>
+          <w:vertAlign w:val="subscript"/>
+        </w:rPr>
+        <w:t>B</w:t>
+      </w:r>
+      <w:r>
+        <w:rPr>
+          <w:b w:val="0"/>
+          <w:i w:val="0"/>
+        </w:rPr>
+        <w:t xml:space="preserve"> with κ converging to about 0.028. A lock threshold defined by mixing-layer enstrophy relative to the hydrodynamic run is not grid-converged, because the inviscid hydrodynamic enstrophy keeps growing with resolution. The deformation comes from a steady, field-aligned shear behind the shock: the shock compresses the gas but not a shock-parallel field, and magnetic tension does not oppose shear along the field. The contrast needed to steer flow into the gaps therefore roughens the interface in proportion. When the stripe wavenumber is half the interface wavenumber, the stripe-induced displacement interferes with the RMI mode with the phase dependence predicted from the jump conditions, producing a zero crossing of the mode followed by inverted growth rather than a sustained lock. This zero crossing is the magnetic counterpart of the phase-dependent interaction between non-uniform shocks and interface perturbations known from hydrodynamic studies; we report it as an observation. Three-dimensional resistive runs at Lundquist number S ≈ 75 show no tearing or breakdown of the shear layers.</w:t>
       </w:r>
     </w:p>
     <w:p>
@@ -92,7 +107,7 @@
     <w:p>
       <w:pPr>
         <w:sectPr>
-          <w:footerReference w:type="default" r:id="rId21"/>
+          <w:footerReference w:type="default" r:id="rId22"/>
           <w:pgSz w:w="11906" w:h="16838"/>
           <w:pgMar w:top="1304" w:right="1247" w:bottom="1304" w:left="1247" w:header="720" w:footer="720" w:gutter="0"/>
           <w:docGrid w:linePitch="360"/>
@@ -1154,7 +1169,7 @@
           <w:b w:val="0"/>
           <w:i w:val="0"/>
         </w:rPr>
-        <w:t>A case is locked if, relative to the hydrodynamic run with identical settings, the late-time mixing-layer enstrophy is below 0.2 and the interface growth is below 0.5. Sweeps A-D measure growth as a₄(t</w:t>
+        <w:t>In sweeps A-F a case was called locked if, relative to the hydrodynamic run with identical settings, the late-time mixing-layer enstrophy was below 0.2 and the interface growth below 0.5 (growth measured as a₄(t</w:t>
       </w:r>
       <w:r>
         <w:rPr>
@@ -1169,7 +1184,7 @@
           <w:b w:val="0"/>
           <w:i w:val="0"/>
         </w:rPr>
-        <w:t>)/a₄(0.05); from sweep E onwards the roughness over all modes is used, so that stripe-scale deformation cannot hide outside the seeded mode.</w:t>
+        <w:t>)/a₄(0.05) in sweeps A-D and as the roughness over all modes from sweep E). Section 4.6 shows that the enstrophy part of this criterion is not grid-converged, so the converged comparison uses the interface roughness and the stripe-scale amplitude a₈ instead.</w:t>
       </w:r>
     </w:p>
     <w:p>
@@ -2346,7 +2361,7 @@
           <w:b w:val="0"/>
           <w:i w:val="0"/>
         </w:rPr>
-        <w:t>A uniform field locks the interface: at B = 2 and B = 3 the mixing-layer enstrophy is 0.03 of the hydrodynamic value, while at B = 1 the growth criterion fails (0.73). Figure 7 shows sweeps C and D against the bar-gap magnetic-pressure contrast ΔP</w:t>
+        <w:t>A uniform field suppresses the instability: at the base resolution, B = 2 and B = 3 reduce the mixing-layer enstrophy to 0.03 of the hydrodynamic value, while B = 1 does not halve the growth (0.73). Figure 7 shows sweeps C and D against the bar-gap magnetic-pressure contrast ΔP</w:t>
       </w:r>
       <w:r>
         <w:rPr>
@@ -2376,7 +2391,7 @@
           <w:b w:val="0"/>
           <w:i w:val="0"/>
         </w:rPr>
-        <w:t>; the criterion is met only for ΔP</w:t>
+        <w:t>. At this resolution the enstrophy criterion is met for ΔP</w:t>
       </w:r>
       <w:r>
         <w:rPr>
@@ -2391,7 +2406,7 @@
           <w:b w:val="0"/>
           <w:i w:val="0"/>
         </w:rPr>
-        <w:t xml:space="preserve"> ≲ 1.2, a field contrast of about 10% at B₀ = 3-3.5 (Table 2).</w:t>
+        <w:t xml:space="preserve"> ≲ 1.2; Section 4.6 shows that this crossing moves to higher contrast on refinement, so it is not a physical threshold. The monotonic increase with contrast is robust at every resolution.</w:t>
       </w:r>
     </w:p>
     <w:p>
@@ -2458,7 +2473,7 @@
           <w:i w:val="0"/>
           <w:sz w:val="18"/>
         </w:rPr>
-        <w:t>Figure 7. Late-time mixing-layer enstrophy relative to the hydrodynamic run, against the bar-gap magnetic-pressure contrast (sweeps C and D). Green: locked. The red point at the smallest contrast is a uniform field B = 1, which meets the enstrophy criterion but not the growth criterion.</w:t>
+        <w:t>Figure 7. Late-time mixing-layer enstrophy relative to the hydrodynamic run, against the bar-gap magnetic-pressure contrast, at the base resolution (sweeps C and D). Green: meets the original lock criterion. The red point at the smallest contrast is a uniform field B = 1, which meets the enstrophy criterion but not the growth criterion. The position of the crossing depends on resolution (Section 4.6).</w:t>
       </w:r>
     </w:p>
     <w:p>
@@ -2481,7 +2496,7 @@
           <w:b w:val="0"/>
           <w:i w:val="0"/>
         </w:rPr>
-        <w:t>The interface spectrum shows where the excess vorticity goes (Fig. 8). At t = 0.8 the hydrodynamic run has a₄ = 0.137 and roughness 0.098; a uniform field B = 3 gives 0.038 and 0.027, and the 10% stripes 0.035 and 0.029. Deep stripes (B₀ = 6, ε = 0.3) also give a₄ = 0.035, but the stripe-scale mode a₈ grows to 0.255 and the roughness to 0.200, twice the hydrodynamic value.</w:t>
+        <w:t>The interface spectrum shows where the excess vorticity goes (Fig. 8). At t = 0.8 the hydrodynamic run has a₄ = 0.137 and roughness 0.098; a uniform field B = 3 gives 0.038 and 0.027, and stripes with 10% field contrast (B₀ = 3.5, ε = 0.9) 0.035 and 0.029. Deep stripes (B₀ = 6, ε = 0.3) also give a₄ = 0.035, but the stripe-scale mode a₈ grows to 0.255 and the roughness to 0.200, twice the hydrodynamic value.</w:t>
       </w:r>
     </w:p>
     <w:p>
@@ -2564,1615 +2579,6 @@
     </w:p>
     <w:p>
       <w:pPr>
-        <w:sectPr>
-          <w:type w:val="continuous"/>
-          <w:pgSz w:w="11906" w:h="16838"/>
-          <w:pgMar w:top="1304" w:right="1247" w:bottom="1304" w:left="1247" w:header="720" w:footer="720" w:gutter="0"/>
-          <w:docGrid w:linePitch="360"/>
-          <w:cols w:num="2" w:space="453"/>
-        </w:sectPr>
-      </w:pPr>
-    </w:p>
-    <w:p>
-      <w:pPr>
-        <w:keepNext/>
-        <w:spacing w:before="240" w:after="100"/>
-        <w:ind w:left="340"/>
-        <w:jc w:val="left"/>
-      </w:pPr>
-      <w:r>
-        <w:rPr>
-          <w:b/>
-          <w:i w:val="0"/>
-          <w:sz w:val="19"/>
-        </w:rPr>
-        <w:t>Table 2.</w:t>
-      </w:r>
-      <w:r>
-        <w:rPr>
-          <w:b w:val="0"/>
-          <w:i w:val="0"/>
-          <w:sz w:val="19"/>
-        </w:rPr>
-        <w:t xml:space="preserve"> </w:t>
-      </w:r>
-      <w:r>
-        <w:rPr>
-          <w:b w:val="0"/>
-          <w:i w:val="0"/>
-          <w:sz w:val="19"/>
-        </w:rPr>
-        <w:t>Selected cases at t = 0.8, relative to the hydrodynamic run. Contrast is (B₀ - εB₀)/B₀.</w:t>
-      </w:r>
-    </w:p>
-    <w:tbl>
-      <w:tblPr>
-        <w:tblW w:type="auto" w:w="0"/>
-        <w:jc w:val="center"/>
-        <w:tblLayout w:type="fixed"/>
-        <w:tblLook w:firstColumn="1" w:firstRow="1" w:lastColumn="0" w:lastRow="0" w:noHBand="0" w:noVBand="1" w:val="04A0"/>
-      </w:tblPr>
-      <w:tblGrid>
-        <w:gridCol w:w="1882"/>
-        <w:gridCol w:w="1882"/>
-        <w:gridCol w:w="1882"/>
-        <w:gridCol w:w="1882"/>
-        <w:gridCol w:w="1882"/>
-      </w:tblGrid>
-      <w:tr>
-        <w:trPr>
-          <w:cantSplit/>
-        </w:trPr>
-        <w:tc>
-          <w:tcPr>
-            <w:tcW w:type="dxa" w:w="2268"/>
-            <w:tcMar>
-              <w:top w:w="60" w:type="dxa"/>
-              <w:bottom w:w="60" w:type="dxa"/>
-              <w:left w:w="90" w:type="dxa"/>
-              <w:right w:w="90" w:type="dxa"/>
-            </w:tcMar>
-            <w:shd w:val="clear" w:color="auto" w:fill="EFEFEF"/>
-            <w:tcBorders>
-              <w:left w:val="nil" w:sz="0" w:color="000000"/>
-              <w:right w:val="nil" w:sz="0" w:color="000000"/>
-              <w:top w:val="single" w:sz="12" w:color="000000"/>
-              <w:bottom w:val="single" w:sz="6" w:color="000000"/>
-            </w:tcBorders>
-          </w:tcPr>
-          <w:p>
-            <w:pPr>
-              <w:keepNext/>
-              <w:spacing w:before="0" w:after="0" w:line="240" w:lineRule="auto"/>
-              <w:jc w:val="left"/>
-            </w:pPr>
-            <w:r/>
-            <w:r>
-              <w:rPr>
-                <w:b/>
-                <w:i w:val="0"/>
-                <w:sz w:val="19"/>
-              </w:rPr>
-              <w:t>Field</w:t>
-            </w:r>
-          </w:p>
-        </w:tc>
-        <w:tc>
-          <w:tcPr>
-            <w:tcW w:type="dxa" w:w="1361"/>
-            <w:tcMar>
-              <w:top w:w="60" w:type="dxa"/>
-              <w:bottom w:w="60" w:type="dxa"/>
-              <w:left w:w="90" w:type="dxa"/>
-              <w:right w:w="90" w:type="dxa"/>
-            </w:tcMar>
-            <w:shd w:val="clear" w:color="auto" w:fill="EFEFEF"/>
-            <w:tcBorders>
-              <w:left w:val="nil" w:sz="0" w:color="000000"/>
-              <w:right w:val="nil" w:sz="0" w:color="000000"/>
-              <w:top w:val="single" w:sz="12" w:color="000000"/>
-              <w:bottom w:val="single" w:sz="6" w:color="000000"/>
-            </w:tcBorders>
-          </w:tcPr>
-          <w:p>
-            <w:pPr>
-              <w:keepNext/>
-              <w:spacing w:before="0" w:after="0" w:line="240" w:lineRule="auto"/>
-              <w:jc w:val="center"/>
-            </w:pPr>
-            <w:r/>
-            <w:r>
-              <w:rPr>
-                <w:b/>
-                <w:i w:val="0"/>
-                <w:sz w:val="19"/>
-              </w:rPr>
-              <w:t>Contrast</w:t>
-            </w:r>
-          </w:p>
-        </w:tc>
-        <w:tc>
-          <w:tcPr>
-            <w:tcW w:type="dxa" w:w="2268"/>
-            <w:tcMar>
-              <w:top w:w="60" w:type="dxa"/>
-              <w:bottom w:w="60" w:type="dxa"/>
-              <w:left w:w="90" w:type="dxa"/>
-              <w:right w:w="90" w:type="dxa"/>
-            </w:tcMar>
-            <w:shd w:val="clear" w:color="auto" w:fill="EFEFEF"/>
-            <w:tcBorders>
-              <w:left w:val="nil" w:sz="0" w:color="000000"/>
-              <w:right w:val="nil" w:sz="0" w:color="000000"/>
-              <w:top w:val="single" w:sz="12" w:color="000000"/>
-              <w:bottom w:val="single" w:sz="6" w:color="000000"/>
-            </w:tcBorders>
-          </w:tcPr>
-          <w:p>
-            <w:pPr>
-              <w:keepNext/>
-              <w:spacing w:before="0" w:after="0" w:line="240" w:lineRule="auto"/>
-              <w:jc w:val="center"/>
-            </w:pPr>
-            <w:r/>
-            <w:r>
-              <w:rPr>
-                <w:b/>
-                <w:i w:val="0"/>
-                <w:sz w:val="19"/>
-              </w:rPr>
-              <w:t>Mixing-layer enstrophy</w:t>
-            </w:r>
-          </w:p>
-        </w:tc>
-        <w:tc>
-          <w:tcPr>
-            <w:tcW w:type="dxa" w:w="1587"/>
-            <w:tcMar>
-              <w:top w:w="60" w:type="dxa"/>
-              <w:bottom w:w="60" w:type="dxa"/>
-              <w:left w:w="90" w:type="dxa"/>
-              <w:right w:w="90" w:type="dxa"/>
-            </w:tcMar>
-            <w:shd w:val="clear" w:color="auto" w:fill="EFEFEF"/>
-            <w:tcBorders>
-              <w:left w:val="nil" w:sz="0" w:color="000000"/>
-              <w:right w:val="nil" w:sz="0" w:color="000000"/>
-              <w:top w:val="single" w:sz="12" w:color="000000"/>
-              <w:bottom w:val="single" w:sz="6" w:color="000000"/>
-            </w:tcBorders>
-          </w:tcPr>
-          <w:p>
-            <w:pPr>
-              <w:keepNext/>
-              <w:spacing w:before="0" w:after="0" w:line="240" w:lineRule="auto"/>
-              <w:jc w:val="center"/>
-            </w:pPr>
-            <w:r/>
-            <w:r>
-              <w:rPr>
-                <w:b/>
-                <w:i w:val="0"/>
-                <w:sz w:val="19"/>
-              </w:rPr>
-              <w:t>Growth of a₄</w:t>
-            </w:r>
-          </w:p>
-        </w:tc>
-        <w:tc>
-          <w:tcPr>
-            <w:tcW w:type="dxa" w:w="1247"/>
-            <w:tcMar>
-              <w:top w:w="60" w:type="dxa"/>
-              <w:bottom w:w="60" w:type="dxa"/>
-              <w:left w:w="90" w:type="dxa"/>
-              <w:right w:w="90" w:type="dxa"/>
-            </w:tcMar>
-            <w:shd w:val="clear" w:color="auto" w:fill="EFEFEF"/>
-            <w:tcBorders>
-              <w:left w:val="nil" w:sz="0" w:color="000000"/>
-              <w:right w:val="nil" w:sz="0" w:color="000000"/>
-              <w:top w:val="single" w:sz="12" w:color="000000"/>
-              <w:bottom w:val="single" w:sz="6" w:color="000000"/>
-            </w:tcBorders>
-          </w:tcPr>
-          <w:p>
-            <w:pPr>
-              <w:keepNext/>
-              <w:spacing w:before="0" w:after="0" w:line="240" w:lineRule="auto"/>
-              <w:jc w:val="center"/>
-            </w:pPr>
-            <w:r/>
-            <w:r>
-              <w:rPr>
-                <w:b/>
-                <w:i w:val="0"/>
-                <w:sz w:val="19"/>
-              </w:rPr>
-              <w:t>Locked</w:t>
-            </w:r>
-          </w:p>
-        </w:tc>
-      </w:tr>
-      <w:tr>
-        <w:trPr>
-          <w:cantSplit/>
-        </w:trPr>
-        <w:tc>
-          <w:tcPr>
-            <w:tcW w:type="dxa" w:w="2268"/>
-            <w:tcMar>
-              <w:top w:w="60" w:type="dxa"/>
-              <w:bottom w:w="60" w:type="dxa"/>
-              <w:left w:w="90" w:type="dxa"/>
-              <w:right w:w="90" w:type="dxa"/>
-            </w:tcMar>
-            <w:tcBorders>
-              <w:left w:val="nil" w:sz="0" w:color="000000"/>
-              <w:right w:val="nil" w:sz="0" w:color="000000"/>
-              <w:top w:val="nil" w:sz="0" w:color="000000"/>
-              <w:bottom w:val="nil" w:sz="0" w:color="000000"/>
-            </w:tcBorders>
-          </w:tcPr>
-          <w:p>
-            <w:pPr>
-              <w:keepNext/>
-              <w:spacing w:before="0" w:after="0" w:line="240" w:lineRule="auto"/>
-              <w:jc w:val="left"/>
-            </w:pPr>
-            <w:r/>
-            <w:r>
-              <w:rPr>
-                <w:b w:val="0"/>
-                <w:i w:val="0"/>
-                <w:sz w:val="19"/>
-              </w:rPr>
-              <w:t>uniform, B = 2</w:t>
-            </w:r>
-          </w:p>
-        </w:tc>
-        <w:tc>
-          <w:tcPr>
-            <w:tcW w:type="dxa" w:w="1361"/>
-            <w:tcMar>
-              <w:top w:w="60" w:type="dxa"/>
-              <w:bottom w:w="60" w:type="dxa"/>
-              <w:left w:w="90" w:type="dxa"/>
-              <w:right w:w="90" w:type="dxa"/>
-            </w:tcMar>
-            <w:tcBorders>
-              <w:left w:val="nil" w:sz="0" w:color="000000"/>
-              <w:right w:val="nil" w:sz="0" w:color="000000"/>
-              <w:top w:val="nil" w:sz="0" w:color="000000"/>
-              <w:bottom w:val="nil" w:sz="0" w:color="000000"/>
-            </w:tcBorders>
-          </w:tcPr>
-          <w:p>
-            <w:pPr>
-              <w:keepNext/>
-              <w:spacing w:before="0" w:after="0" w:line="240" w:lineRule="auto"/>
-              <w:jc w:val="center"/>
-            </w:pPr>
-            <w:r/>
-            <w:r>
-              <w:rPr>
-                <w:b w:val="0"/>
-                <w:i w:val="0"/>
-                <w:sz w:val="19"/>
-              </w:rPr>
-              <w:t>0</w:t>
-            </w:r>
-          </w:p>
-        </w:tc>
-        <w:tc>
-          <w:tcPr>
-            <w:tcW w:type="dxa" w:w="2268"/>
-            <w:tcMar>
-              <w:top w:w="60" w:type="dxa"/>
-              <w:bottom w:w="60" w:type="dxa"/>
-              <w:left w:w="90" w:type="dxa"/>
-              <w:right w:w="90" w:type="dxa"/>
-            </w:tcMar>
-            <w:tcBorders>
-              <w:left w:val="nil" w:sz="0" w:color="000000"/>
-              <w:right w:val="nil" w:sz="0" w:color="000000"/>
-              <w:top w:val="nil" w:sz="0" w:color="000000"/>
-              <w:bottom w:val="nil" w:sz="0" w:color="000000"/>
-            </w:tcBorders>
-          </w:tcPr>
-          <w:p>
-            <w:pPr>
-              <w:keepNext/>
-              <w:spacing w:before="0" w:after="0" w:line="240" w:lineRule="auto"/>
-              <w:jc w:val="center"/>
-            </w:pPr>
-            <w:r/>
-            <w:r>
-              <w:rPr>
-                <w:b w:val="0"/>
-                <w:i w:val="0"/>
-                <w:sz w:val="19"/>
-              </w:rPr>
-              <w:t>0.029</w:t>
-            </w:r>
-          </w:p>
-        </w:tc>
-        <w:tc>
-          <w:tcPr>
-            <w:tcW w:type="dxa" w:w="1587"/>
-            <w:tcMar>
-              <w:top w:w="60" w:type="dxa"/>
-              <w:bottom w:w="60" w:type="dxa"/>
-              <w:left w:w="90" w:type="dxa"/>
-              <w:right w:w="90" w:type="dxa"/>
-            </w:tcMar>
-            <w:tcBorders>
-              <w:left w:val="nil" w:sz="0" w:color="000000"/>
-              <w:right w:val="nil" w:sz="0" w:color="000000"/>
-              <w:top w:val="nil" w:sz="0" w:color="000000"/>
-              <w:bottom w:val="nil" w:sz="0" w:color="000000"/>
-            </w:tcBorders>
-          </w:tcPr>
-          <w:p>
-            <w:pPr>
-              <w:keepNext/>
-              <w:spacing w:before="0" w:after="0" w:line="240" w:lineRule="auto"/>
-              <w:jc w:val="center"/>
-            </w:pPr>
-            <w:r/>
-            <w:r>
-              <w:rPr>
-                <w:b w:val="0"/>
-                <w:i w:val="0"/>
-                <w:sz w:val="19"/>
-              </w:rPr>
-              <w:t>0.40</w:t>
-            </w:r>
-          </w:p>
-        </w:tc>
-        <w:tc>
-          <w:tcPr>
-            <w:tcW w:type="dxa" w:w="1247"/>
-            <w:tcMar>
-              <w:top w:w="60" w:type="dxa"/>
-              <w:bottom w:w="60" w:type="dxa"/>
-              <w:left w:w="90" w:type="dxa"/>
-              <w:right w:w="90" w:type="dxa"/>
-            </w:tcMar>
-            <w:tcBorders>
-              <w:left w:val="nil" w:sz="0" w:color="000000"/>
-              <w:right w:val="nil" w:sz="0" w:color="000000"/>
-              <w:top w:val="nil" w:sz="0" w:color="000000"/>
-              <w:bottom w:val="nil" w:sz="0" w:color="000000"/>
-            </w:tcBorders>
-          </w:tcPr>
-          <w:p>
-            <w:pPr>
-              <w:keepNext/>
-              <w:spacing w:before="0" w:after="0" w:line="240" w:lineRule="auto"/>
-              <w:jc w:val="center"/>
-            </w:pPr>
-            <w:r/>
-            <w:r>
-              <w:rPr>
-                <w:b w:val="0"/>
-                <w:i w:val="0"/>
-                <w:sz w:val="19"/>
-              </w:rPr>
-              <w:t>yes</w:t>
-            </w:r>
-          </w:p>
-        </w:tc>
-      </w:tr>
-      <w:tr>
-        <w:trPr>
-          <w:cantSplit/>
-        </w:trPr>
-        <w:tc>
-          <w:tcPr>
-            <w:tcW w:type="dxa" w:w="2268"/>
-            <w:tcMar>
-              <w:top w:w="60" w:type="dxa"/>
-              <w:bottom w:w="60" w:type="dxa"/>
-              <w:left w:w="90" w:type="dxa"/>
-              <w:right w:w="90" w:type="dxa"/>
-            </w:tcMar>
-            <w:tcBorders>
-              <w:left w:val="nil" w:sz="0" w:color="000000"/>
-              <w:right w:val="nil" w:sz="0" w:color="000000"/>
-              <w:top w:val="nil" w:sz="0" w:color="000000"/>
-              <w:bottom w:val="nil" w:sz="0" w:color="000000"/>
-            </w:tcBorders>
-          </w:tcPr>
-          <w:p>
-            <w:pPr>
-              <w:keepNext/>
-              <w:spacing w:before="0" w:after="0" w:line="240" w:lineRule="auto"/>
-              <w:jc w:val="left"/>
-            </w:pPr>
-            <w:r/>
-            <w:r>
-              <w:rPr>
-                <w:b w:val="0"/>
-                <w:i w:val="0"/>
-                <w:sz w:val="19"/>
-              </w:rPr>
-              <w:t>uniform, B = 3</w:t>
-            </w:r>
-          </w:p>
-        </w:tc>
-        <w:tc>
-          <w:tcPr>
-            <w:tcW w:type="dxa" w:w="1361"/>
-            <w:tcMar>
-              <w:top w:w="60" w:type="dxa"/>
-              <w:bottom w:w="60" w:type="dxa"/>
-              <w:left w:w="90" w:type="dxa"/>
-              <w:right w:w="90" w:type="dxa"/>
-            </w:tcMar>
-            <w:tcBorders>
-              <w:left w:val="nil" w:sz="0" w:color="000000"/>
-              <w:right w:val="nil" w:sz="0" w:color="000000"/>
-              <w:top w:val="nil" w:sz="0" w:color="000000"/>
-              <w:bottom w:val="nil" w:sz="0" w:color="000000"/>
-            </w:tcBorders>
-          </w:tcPr>
-          <w:p>
-            <w:pPr>
-              <w:keepNext/>
-              <w:spacing w:before="0" w:after="0" w:line="240" w:lineRule="auto"/>
-              <w:jc w:val="center"/>
-            </w:pPr>
-            <w:r/>
-            <w:r>
-              <w:rPr>
-                <w:b w:val="0"/>
-                <w:i w:val="0"/>
-                <w:sz w:val="19"/>
-              </w:rPr>
-              <w:t>0</w:t>
-            </w:r>
-          </w:p>
-        </w:tc>
-        <w:tc>
-          <w:tcPr>
-            <w:tcW w:type="dxa" w:w="2268"/>
-            <w:tcMar>
-              <w:top w:w="60" w:type="dxa"/>
-              <w:bottom w:w="60" w:type="dxa"/>
-              <w:left w:w="90" w:type="dxa"/>
-              <w:right w:w="90" w:type="dxa"/>
-            </w:tcMar>
-            <w:tcBorders>
-              <w:left w:val="nil" w:sz="0" w:color="000000"/>
-              <w:right w:val="nil" w:sz="0" w:color="000000"/>
-              <w:top w:val="nil" w:sz="0" w:color="000000"/>
-              <w:bottom w:val="nil" w:sz="0" w:color="000000"/>
-            </w:tcBorders>
-          </w:tcPr>
-          <w:p>
-            <w:pPr>
-              <w:keepNext/>
-              <w:spacing w:before="0" w:after="0" w:line="240" w:lineRule="auto"/>
-              <w:jc w:val="center"/>
-            </w:pPr>
-            <w:r/>
-            <w:r>
-              <w:rPr>
-                <w:b w:val="0"/>
-                <w:i w:val="0"/>
-                <w:sz w:val="19"/>
-              </w:rPr>
-              <w:t>0.031</w:t>
-            </w:r>
-          </w:p>
-        </w:tc>
-        <w:tc>
-          <w:tcPr>
-            <w:tcW w:type="dxa" w:w="1587"/>
-            <w:tcMar>
-              <w:top w:w="60" w:type="dxa"/>
-              <w:bottom w:w="60" w:type="dxa"/>
-              <w:left w:w="90" w:type="dxa"/>
-              <w:right w:w="90" w:type="dxa"/>
-            </w:tcMar>
-            <w:tcBorders>
-              <w:left w:val="nil" w:sz="0" w:color="000000"/>
-              <w:right w:val="nil" w:sz="0" w:color="000000"/>
-              <w:top w:val="nil" w:sz="0" w:color="000000"/>
-              <w:bottom w:val="nil" w:sz="0" w:color="000000"/>
-            </w:tcBorders>
-          </w:tcPr>
-          <w:p>
-            <w:pPr>
-              <w:keepNext/>
-              <w:spacing w:before="0" w:after="0" w:line="240" w:lineRule="auto"/>
-              <w:jc w:val="center"/>
-            </w:pPr>
-            <w:r/>
-            <w:r>
-              <w:rPr>
-                <w:b w:val="0"/>
-                <w:i w:val="0"/>
-                <w:sz w:val="19"/>
-              </w:rPr>
-              <w:t>0.28</w:t>
-            </w:r>
-          </w:p>
-        </w:tc>
-        <w:tc>
-          <w:tcPr>
-            <w:tcW w:type="dxa" w:w="1247"/>
-            <w:tcMar>
-              <w:top w:w="60" w:type="dxa"/>
-              <w:bottom w:w="60" w:type="dxa"/>
-              <w:left w:w="90" w:type="dxa"/>
-              <w:right w:w="90" w:type="dxa"/>
-            </w:tcMar>
-            <w:tcBorders>
-              <w:left w:val="nil" w:sz="0" w:color="000000"/>
-              <w:right w:val="nil" w:sz="0" w:color="000000"/>
-              <w:top w:val="nil" w:sz="0" w:color="000000"/>
-              <w:bottom w:val="nil" w:sz="0" w:color="000000"/>
-            </w:tcBorders>
-          </w:tcPr>
-          <w:p>
-            <w:pPr>
-              <w:keepNext/>
-              <w:spacing w:before="0" w:after="0" w:line="240" w:lineRule="auto"/>
-              <w:jc w:val="center"/>
-            </w:pPr>
-            <w:r/>
-            <w:r>
-              <w:rPr>
-                <w:b w:val="0"/>
-                <w:i w:val="0"/>
-                <w:sz w:val="19"/>
-              </w:rPr>
-              <w:t>yes</w:t>
-            </w:r>
-          </w:p>
-        </w:tc>
-      </w:tr>
-      <w:tr>
-        <w:trPr>
-          <w:cantSplit/>
-        </w:trPr>
-        <w:tc>
-          <w:tcPr>
-            <w:tcW w:type="dxa" w:w="2268"/>
-            <w:tcMar>
-              <w:top w:w="60" w:type="dxa"/>
-              <w:bottom w:w="60" w:type="dxa"/>
-              <w:left w:w="90" w:type="dxa"/>
-              <w:right w:w="90" w:type="dxa"/>
-            </w:tcMar>
-            <w:tcBorders>
-              <w:left w:val="nil" w:sz="0" w:color="000000"/>
-              <w:right w:val="nil" w:sz="0" w:color="000000"/>
-              <w:top w:val="nil" w:sz="0" w:color="000000"/>
-              <w:bottom w:val="nil" w:sz="0" w:color="000000"/>
-            </w:tcBorders>
-          </w:tcPr>
-          <w:p>
-            <w:pPr>
-              <w:keepNext/>
-              <w:spacing w:before="0" w:after="0" w:line="240" w:lineRule="auto"/>
-              <w:jc w:val="left"/>
-            </w:pPr>
-            <w:r/>
-            <w:r>
-              <w:rPr>
-                <w:b w:val="0"/>
-                <w:i w:val="0"/>
-                <w:sz w:val="19"/>
-              </w:rPr>
-              <w:t>B₀ = 3, ε = 0.9</w:t>
-            </w:r>
-          </w:p>
-        </w:tc>
-        <w:tc>
-          <w:tcPr>
-            <w:tcW w:type="dxa" w:w="1361"/>
-            <w:tcMar>
-              <w:top w:w="60" w:type="dxa"/>
-              <w:bottom w:w="60" w:type="dxa"/>
-              <w:left w:w="90" w:type="dxa"/>
-              <w:right w:w="90" w:type="dxa"/>
-            </w:tcMar>
-            <w:tcBorders>
-              <w:left w:val="nil" w:sz="0" w:color="000000"/>
-              <w:right w:val="nil" w:sz="0" w:color="000000"/>
-              <w:top w:val="nil" w:sz="0" w:color="000000"/>
-              <w:bottom w:val="nil" w:sz="0" w:color="000000"/>
-            </w:tcBorders>
-          </w:tcPr>
-          <w:p>
-            <w:pPr>
-              <w:keepNext/>
-              <w:spacing w:before="0" w:after="0" w:line="240" w:lineRule="auto"/>
-              <w:jc w:val="center"/>
-            </w:pPr>
-            <w:r/>
-            <w:r>
-              <w:rPr>
-                <w:b w:val="0"/>
-                <w:i w:val="0"/>
-                <w:sz w:val="19"/>
-              </w:rPr>
-              <w:t>10%</w:t>
-            </w:r>
-          </w:p>
-        </w:tc>
-        <w:tc>
-          <w:tcPr>
-            <w:tcW w:type="dxa" w:w="2268"/>
-            <w:tcMar>
-              <w:top w:w="60" w:type="dxa"/>
-              <w:bottom w:w="60" w:type="dxa"/>
-              <w:left w:w="90" w:type="dxa"/>
-              <w:right w:w="90" w:type="dxa"/>
-            </w:tcMar>
-            <w:tcBorders>
-              <w:left w:val="nil" w:sz="0" w:color="000000"/>
-              <w:right w:val="nil" w:sz="0" w:color="000000"/>
-              <w:top w:val="nil" w:sz="0" w:color="000000"/>
-              <w:bottom w:val="nil" w:sz="0" w:color="000000"/>
-            </w:tcBorders>
-          </w:tcPr>
-          <w:p>
-            <w:pPr>
-              <w:keepNext/>
-              <w:spacing w:before="0" w:after="0" w:line="240" w:lineRule="auto"/>
-              <w:jc w:val="center"/>
-            </w:pPr>
-            <w:r/>
-            <w:r>
-              <w:rPr>
-                <w:b w:val="0"/>
-                <w:i w:val="0"/>
-                <w:sz w:val="19"/>
-              </w:rPr>
-              <w:t>0.064</w:t>
-            </w:r>
-          </w:p>
-        </w:tc>
-        <w:tc>
-          <w:tcPr>
-            <w:tcW w:type="dxa" w:w="1587"/>
-            <w:tcMar>
-              <w:top w:w="60" w:type="dxa"/>
-              <w:bottom w:w="60" w:type="dxa"/>
-              <w:left w:w="90" w:type="dxa"/>
-              <w:right w:w="90" w:type="dxa"/>
-            </w:tcMar>
-            <w:tcBorders>
-              <w:left w:val="nil" w:sz="0" w:color="000000"/>
-              <w:right w:val="nil" w:sz="0" w:color="000000"/>
-              <w:top w:val="nil" w:sz="0" w:color="000000"/>
-              <w:bottom w:val="nil" w:sz="0" w:color="000000"/>
-            </w:tcBorders>
-          </w:tcPr>
-          <w:p>
-            <w:pPr>
-              <w:keepNext/>
-              <w:spacing w:before="0" w:after="0" w:line="240" w:lineRule="auto"/>
-              <w:jc w:val="center"/>
-            </w:pPr>
-            <w:r/>
-            <w:r>
-              <w:rPr>
-                <w:b w:val="0"/>
-                <w:i w:val="0"/>
-                <w:sz w:val="19"/>
-              </w:rPr>
-              <w:t>0.29</w:t>
-            </w:r>
-          </w:p>
-        </w:tc>
-        <w:tc>
-          <w:tcPr>
-            <w:tcW w:type="dxa" w:w="1247"/>
-            <w:tcMar>
-              <w:top w:w="60" w:type="dxa"/>
-              <w:bottom w:w="60" w:type="dxa"/>
-              <w:left w:w="90" w:type="dxa"/>
-              <w:right w:w="90" w:type="dxa"/>
-            </w:tcMar>
-            <w:tcBorders>
-              <w:left w:val="nil" w:sz="0" w:color="000000"/>
-              <w:right w:val="nil" w:sz="0" w:color="000000"/>
-              <w:top w:val="nil" w:sz="0" w:color="000000"/>
-              <w:bottom w:val="nil" w:sz="0" w:color="000000"/>
-            </w:tcBorders>
-          </w:tcPr>
-          <w:p>
-            <w:pPr>
-              <w:keepNext/>
-              <w:spacing w:before="0" w:after="0" w:line="240" w:lineRule="auto"/>
-              <w:jc w:val="center"/>
-            </w:pPr>
-            <w:r/>
-            <w:r>
-              <w:rPr>
-                <w:b w:val="0"/>
-                <w:i w:val="0"/>
-                <w:sz w:val="19"/>
-              </w:rPr>
-              <w:t>yes</w:t>
-            </w:r>
-          </w:p>
-        </w:tc>
-      </w:tr>
-      <w:tr>
-        <w:trPr>
-          <w:cantSplit/>
-        </w:trPr>
-        <w:tc>
-          <w:tcPr>
-            <w:tcW w:type="dxa" w:w="2268"/>
-            <w:tcMar>
-              <w:top w:w="60" w:type="dxa"/>
-              <w:bottom w:w="60" w:type="dxa"/>
-              <w:left w:w="90" w:type="dxa"/>
-              <w:right w:w="90" w:type="dxa"/>
-            </w:tcMar>
-            <w:tcBorders>
-              <w:left w:val="nil" w:sz="0" w:color="000000"/>
-              <w:right w:val="nil" w:sz="0" w:color="000000"/>
-              <w:top w:val="nil" w:sz="0" w:color="000000"/>
-              <w:bottom w:val="nil" w:sz="0" w:color="000000"/>
-            </w:tcBorders>
-          </w:tcPr>
-          <w:p>
-            <w:pPr>
-              <w:keepNext/>
-              <w:spacing w:before="0" w:after="0" w:line="240" w:lineRule="auto"/>
-              <w:jc w:val="left"/>
-            </w:pPr>
-            <w:r/>
-            <w:r>
-              <w:rPr>
-                <w:b w:val="0"/>
-                <w:i w:val="0"/>
-                <w:sz w:val="19"/>
-              </w:rPr>
-              <w:t>B₀ = 3.5, ε = 0.9</w:t>
-            </w:r>
-          </w:p>
-        </w:tc>
-        <w:tc>
-          <w:tcPr>
-            <w:tcW w:type="dxa" w:w="1361"/>
-            <w:tcMar>
-              <w:top w:w="60" w:type="dxa"/>
-              <w:bottom w:w="60" w:type="dxa"/>
-              <w:left w:w="90" w:type="dxa"/>
-              <w:right w:w="90" w:type="dxa"/>
-            </w:tcMar>
-            <w:tcBorders>
-              <w:left w:val="nil" w:sz="0" w:color="000000"/>
-              <w:right w:val="nil" w:sz="0" w:color="000000"/>
-              <w:top w:val="nil" w:sz="0" w:color="000000"/>
-              <w:bottom w:val="nil" w:sz="0" w:color="000000"/>
-            </w:tcBorders>
-          </w:tcPr>
-          <w:p>
-            <w:pPr>
-              <w:keepNext/>
-              <w:spacing w:before="0" w:after="0" w:line="240" w:lineRule="auto"/>
-              <w:jc w:val="center"/>
-            </w:pPr>
-            <w:r/>
-            <w:r>
-              <w:rPr>
-                <w:b w:val="0"/>
-                <w:i w:val="0"/>
-                <w:sz w:val="19"/>
-              </w:rPr>
-              <w:t>10%</w:t>
-            </w:r>
-          </w:p>
-        </w:tc>
-        <w:tc>
-          <w:tcPr>
-            <w:tcW w:type="dxa" w:w="2268"/>
-            <w:tcMar>
-              <w:top w:w="60" w:type="dxa"/>
-              <w:bottom w:w="60" w:type="dxa"/>
-              <w:left w:w="90" w:type="dxa"/>
-              <w:right w:w="90" w:type="dxa"/>
-            </w:tcMar>
-            <w:tcBorders>
-              <w:left w:val="nil" w:sz="0" w:color="000000"/>
-              <w:right w:val="nil" w:sz="0" w:color="000000"/>
-              <w:top w:val="nil" w:sz="0" w:color="000000"/>
-              <w:bottom w:val="nil" w:sz="0" w:color="000000"/>
-            </w:tcBorders>
-          </w:tcPr>
-          <w:p>
-            <w:pPr>
-              <w:keepNext/>
-              <w:spacing w:before="0" w:after="0" w:line="240" w:lineRule="auto"/>
-              <w:jc w:val="center"/>
-            </w:pPr>
-            <w:r/>
-            <w:r>
-              <w:rPr>
-                <w:b w:val="0"/>
-                <w:i w:val="0"/>
-                <w:sz w:val="19"/>
-              </w:rPr>
-              <w:t>0.126</w:t>
-            </w:r>
-          </w:p>
-        </w:tc>
-        <w:tc>
-          <w:tcPr>
-            <w:tcW w:type="dxa" w:w="1587"/>
-            <w:tcMar>
-              <w:top w:w="60" w:type="dxa"/>
-              <w:bottom w:w="60" w:type="dxa"/>
-              <w:left w:w="90" w:type="dxa"/>
-              <w:right w:w="90" w:type="dxa"/>
-            </w:tcMar>
-            <w:tcBorders>
-              <w:left w:val="nil" w:sz="0" w:color="000000"/>
-              <w:right w:val="nil" w:sz="0" w:color="000000"/>
-              <w:top w:val="nil" w:sz="0" w:color="000000"/>
-              <w:bottom w:val="nil" w:sz="0" w:color="000000"/>
-            </w:tcBorders>
-          </w:tcPr>
-          <w:p>
-            <w:pPr>
-              <w:keepNext/>
-              <w:spacing w:before="0" w:after="0" w:line="240" w:lineRule="auto"/>
-              <w:jc w:val="center"/>
-            </w:pPr>
-            <w:r/>
-            <w:r>
-              <w:rPr>
-                <w:b w:val="0"/>
-                <w:i w:val="0"/>
-                <w:sz w:val="19"/>
-              </w:rPr>
-              <w:t>0.26</w:t>
-            </w:r>
-          </w:p>
-        </w:tc>
-        <w:tc>
-          <w:tcPr>
-            <w:tcW w:type="dxa" w:w="1247"/>
-            <w:tcMar>
-              <w:top w:w="60" w:type="dxa"/>
-              <w:bottom w:w="60" w:type="dxa"/>
-              <w:left w:w="90" w:type="dxa"/>
-              <w:right w:w="90" w:type="dxa"/>
-            </w:tcMar>
-            <w:tcBorders>
-              <w:left w:val="nil" w:sz="0" w:color="000000"/>
-              <w:right w:val="nil" w:sz="0" w:color="000000"/>
-              <w:top w:val="nil" w:sz="0" w:color="000000"/>
-              <w:bottom w:val="nil" w:sz="0" w:color="000000"/>
-            </w:tcBorders>
-          </w:tcPr>
-          <w:p>
-            <w:pPr>
-              <w:keepNext/>
-              <w:spacing w:before="0" w:after="0" w:line="240" w:lineRule="auto"/>
-              <w:jc w:val="center"/>
-            </w:pPr>
-            <w:r/>
-            <w:r>
-              <w:rPr>
-                <w:b w:val="0"/>
-                <w:i w:val="0"/>
-                <w:sz w:val="19"/>
-              </w:rPr>
-              <w:t>yes</w:t>
-            </w:r>
-          </w:p>
-        </w:tc>
-      </w:tr>
-      <w:tr>
-        <w:trPr>
-          <w:cantSplit/>
-        </w:trPr>
-        <w:tc>
-          <w:tcPr>
-            <w:tcW w:type="dxa" w:w="2268"/>
-            <w:tcMar>
-              <w:top w:w="60" w:type="dxa"/>
-              <w:bottom w:w="60" w:type="dxa"/>
-              <w:left w:w="90" w:type="dxa"/>
-              <w:right w:w="90" w:type="dxa"/>
-            </w:tcMar>
-            <w:tcBorders>
-              <w:left w:val="nil" w:sz="0" w:color="000000"/>
-              <w:right w:val="nil" w:sz="0" w:color="000000"/>
-              <w:top w:val="nil" w:sz="0" w:color="000000"/>
-              <w:bottom w:val="nil" w:sz="0" w:color="000000"/>
-            </w:tcBorders>
-          </w:tcPr>
-          <w:p>
-            <w:pPr>
-              <w:keepNext/>
-              <w:spacing w:before="0" w:after="0" w:line="240" w:lineRule="auto"/>
-              <w:jc w:val="left"/>
-            </w:pPr>
-            <w:r/>
-            <w:r>
-              <w:rPr>
-                <w:b w:val="0"/>
-                <w:i w:val="0"/>
-                <w:sz w:val="19"/>
-              </w:rPr>
-              <w:t>B₀ = 4, ε = 0.9</w:t>
-            </w:r>
-          </w:p>
-        </w:tc>
-        <w:tc>
-          <w:tcPr>
-            <w:tcW w:type="dxa" w:w="1361"/>
-            <w:tcMar>
-              <w:top w:w="60" w:type="dxa"/>
-              <w:bottom w:w="60" w:type="dxa"/>
-              <w:left w:w="90" w:type="dxa"/>
-              <w:right w:w="90" w:type="dxa"/>
-            </w:tcMar>
-            <w:tcBorders>
-              <w:left w:val="nil" w:sz="0" w:color="000000"/>
-              <w:right w:val="nil" w:sz="0" w:color="000000"/>
-              <w:top w:val="nil" w:sz="0" w:color="000000"/>
-              <w:bottom w:val="nil" w:sz="0" w:color="000000"/>
-            </w:tcBorders>
-          </w:tcPr>
-          <w:p>
-            <w:pPr>
-              <w:keepNext/>
-              <w:spacing w:before="0" w:after="0" w:line="240" w:lineRule="auto"/>
-              <w:jc w:val="center"/>
-            </w:pPr>
-            <w:r/>
-            <w:r>
-              <w:rPr>
-                <w:b w:val="0"/>
-                <w:i w:val="0"/>
-                <w:sz w:val="19"/>
-              </w:rPr>
-              <w:t>10%</w:t>
-            </w:r>
-          </w:p>
-        </w:tc>
-        <w:tc>
-          <w:tcPr>
-            <w:tcW w:type="dxa" w:w="2268"/>
-            <w:tcMar>
-              <w:top w:w="60" w:type="dxa"/>
-              <w:bottom w:w="60" w:type="dxa"/>
-              <w:left w:w="90" w:type="dxa"/>
-              <w:right w:w="90" w:type="dxa"/>
-            </w:tcMar>
-            <w:tcBorders>
-              <w:left w:val="nil" w:sz="0" w:color="000000"/>
-              <w:right w:val="nil" w:sz="0" w:color="000000"/>
-              <w:top w:val="nil" w:sz="0" w:color="000000"/>
-              <w:bottom w:val="nil" w:sz="0" w:color="000000"/>
-            </w:tcBorders>
-          </w:tcPr>
-          <w:p>
-            <w:pPr>
-              <w:keepNext/>
-              <w:spacing w:before="0" w:after="0" w:line="240" w:lineRule="auto"/>
-              <w:jc w:val="center"/>
-            </w:pPr>
-            <w:r/>
-            <w:r>
-              <w:rPr>
-                <w:b w:val="0"/>
-                <w:i w:val="0"/>
-                <w:sz w:val="19"/>
-              </w:rPr>
-              <w:t>0.213</w:t>
-            </w:r>
-          </w:p>
-        </w:tc>
-        <w:tc>
-          <w:tcPr>
-            <w:tcW w:type="dxa" w:w="1587"/>
-            <w:tcMar>
-              <w:top w:w="60" w:type="dxa"/>
-              <w:bottom w:w="60" w:type="dxa"/>
-              <w:left w:w="90" w:type="dxa"/>
-              <w:right w:w="90" w:type="dxa"/>
-            </w:tcMar>
-            <w:tcBorders>
-              <w:left w:val="nil" w:sz="0" w:color="000000"/>
-              <w:right w:val="nil" w:sz="0" w:color="000000"/>
-              <w:top w:val="nil" w:sz="0" w:color="000000"/>
-              <w:bottom w:val="nil" w:sz="0" w:color="000000"/>
-            </w:tcBorders>
-          </w:tcPr>
-          <w:p>
-            <w:pPr>
-              <w:keepNext/>
-              <w:spacing w:before="0" w:after="0" w:line="240" w:lineRule="auto"/>
-              <w:jc w:val="center"/>
-            </w:pPr>
-            <w:r/>
-            <w:r>
-              <w:rPr>
-                <w:b w:val="0"/>
-                <w:i w:val="0"/>
-                <w:sz w:val="19"/>
-              </w:rPr>
-              <w:t>0.24</w:t>
-            </w:r>
-          </w:p>
-        </w:tc>
-        <w:tc>
-          <w:tcPr>
-            <w:tcW w:type="dxa" w:w="1247"/>
-            <w:tcMar>
-              <w:top w:w="60" w:type="dxa"/>
-              <w:bottom w:w="60" w:type="dxa"/>
-              <w:left w:w="90" w:type="dxa"/>
-              <w:right w:w="90" w:type="dxa"/>
-            </w:tcMar>
-            <w:tcBorders>
-              <w:left w:val="nil" w:sz="0" w:color="000000"/>
-              <w:right w:val="nil" w:sz="0" w:color="000000"/>
-              <w:top w:val="nil" w:sz="0" w:color="000000"/>
-              <w:bottom w:val="nil" w:sz="0" w:color="000000"/>
-            </w:tcBorders>
-          </w:tcPr>
-          <w:p>
-            <w:pPr>
-              <w:keepNext/>
-              <w:spacing w:before="0" w:after="0" w:line="240" w:lineRule="auto"/>
-              <w:jc w:val="center"/>
-            </w:pPr>
-            <w:r/>
-            <w:r>
-              <w:rPr>
-                <w:b w:val="0"/>
-                <w:i w:val="0"/>
-                <w:sz w:val="19"/>
-              </w:rPr>
-              <w:t>no</w:t>
-            </w:r>
-          </w:p>
-        </w:tc>
-      </w:tr>
-      <w:tr>
-        <w:trPr>
-          <w:cantSplit/>
-        </w:trPr>
-        <w:tc>
-          <w:tcPr>
-            <w:tcW w:type="dxa" w:w="2268"/>
-            <w:tcMar>
-              <w:top w:w="60" w:type="dxa"/>
-              <w:bottom w:w="60" w:type="dxa"/>
-              <w:left w:w="90" w:type="dxa"/>
-              <w:right w:w="90" w:type="dxa"/>
-            </w:tcMar>
-            <w:tcBorders>
-              <w:left w:val="nil" w:sz="0" w:color="000000"/>
-              <w:right w:val="nil" w:sz="0" w:color="000000"/>
-              <w:top w:val="nil" w:sz="0" w:color="000000"/>
-              <w:bottom w:val="nil" w:sz="0" w:color="000000"/>
-            </w:tcBorders>
-          </w:tcPr>
-          <w:p>
-            <w:pPr>
-              <w:keepNext/>
-              <w:spacing w:before="0" w:after="0" w:line="240" w:lineRule="auto"/>
-              <w:jc w:val="left"/>
-            </w:pPr>
-            <w:r/>
-            <w:r>
-              <w:rPr>
-                <w:b w:val="0"/>
-                <w:i w:val="0"/>
-                <w:sz w:val="19"/>
-              </w:rPr>
-              <w:t>B₀ = 3.5, ε = 0.8</w:t>
-            </w:r>
-          </w:p>
-        </w:tc>
-        <w:tc>
-          <w:tcPr>
-            <w:tcW w:type="dxa" w:w="1361"/>
-            <w:tcMar>
-              <w:top w:w="60" w:type="dxa"/>
-              <w:bottom w:w="60" w:type="dxa"/>
-              <w:left w:w="90" w:type="dxa"/>
-              <w:right w:w="90" w:type="dxa"/>
-            </w:tcMar>
-            <w:tcBorders>
-              <w:left w:val="nil" w:sz="0" w:color="000000"/>
-              <w:right w:val="nil" w:sz="0" w:color="000000"/>
-              <w:top w:val="nil" w:sz="0" w:color="000000"/>
-              <w:bottom w:val="nil" w:sz="0" w:color="000000"/>
-            </w:tcBorders>
-          </w:tcPr>
-          <w:p>
-            <w:pPr>
-              <w:keepNext/>
-              <w:spacing w:before="0" w:after="0" w:line="240" w:lineRule="auto"/>
-              <w:jc w:val="center"/>
-            </w:pPr>
-            <w:r/>
-            <w:r>
-              <w:rPr>
-                <w:b w:val="0"/>
-                <w:i w:val="0"/>
-                <w:sz w:val="19"/>
-              </w:rPr>
-              <w:t>20%</w:t>
-            </w:r>
-          </w:p>
-        </w:tc>
-        <w:tc>
-          <w:tcPr>
-            <w:tcW w:type="dxa" w:w="2268"/>
-            <w:tcMar>
-              <w:top w:w="60" w:type="dxa"/>
-              <w:bottom w:w="60" w:type="dxa"/>
-              <w:left w:w="90" w:type="dxa"/>
-              <w:right w:w="90" w:type="dxa"/>
-            </w:tcMar>
-            <w:tcBorders>
-              <w:left w:val="nil" w:sz="0" w:color="000000"/>
-              <w:right w:val="nil" w:sz="0" w:color="000000"/>
-              <w:top w:val="nil" w:sz="0" w:color="000000"/>
-              <w:bottom w:val="nil" w:sz="0" w:color="000000"/>
-            </w:tcBorders>
-          </w:tcPr>
-          <w:p>
-            <w:pPr>
-              <w:keepNext/>
-              <w:spacing w:before="0" w:after="0" w:line="240" w:lineRule="auto"/>
-              <w:jc w:val="center"/>
-            </w:pPr>
-            <w:r/>
-            <w:r>
-              <w:rPr>
-                <w:b w:val="0"/>
-                <w:i w:val="0"/>
-                <w:sz w:val="19"/>
-              </w:rPr>
-              <w:t>0.367</w:t>
-            </w:r>
-          </w:p>
-        </w:tc>
-        <w:tc>
-          <w:tcPr>
-            <w:tcW w:type="dxa" w:w="1587"/>
-            <w:tcMar>
-              <w:top w:w="60" w:type="dxa"/>
-              <w:bottom w:w="60" w:type="dxa"/>
-              <w:left w:w="90" w:type="dxa"/>
-              <w:right w:w="90" w:type="dxa"/>
-            </w:tcMar>
-            <w:tcBorders>
-              <w:left w:val="nil" w:sz="0" w:color="000000"/>
-              <w:right w:val="nil" w:sz="0" w:color="000000"/>
-              <w:top w:val="nil" w:sz="0" w:color="000000"/>
-              <w:bottom w:val="nil" w:sz="0" w:color="000000"/>
-            </w:tcBorders>
-          </w:tcPr>
-          <w:p>
-            <w:pPr>
-              <w:keepNext/>
-              <w:spacing w:before="0" w:after="0" w:line="240" w:lineRule="auto"/>
-              <w:jc w:val="center"/>
-            </w:pPr>
-            <w:r/>
-            <w:r>
-              <w:rPr>
-                <w:b w:val="0"/>
-                <w:i w:val="0"/>
-                <w:sz w:val="19"/>
-              </w:rPr>
-              <w:t>0.27</w:t>
-            </w:r>
-          </w:p>
-        </w:tc>
-        <w:tc>
-          <w:tcPr>
-            <w:tcW w:type="dxa" w:w="1247"/>
-            <w:tcMar>
-              <w:top w:w="60" w:type="dxa"/>
-              <w:bottom w:w="60" w:type="dxa"/>
-              <w:left w:w="90" w:type="dxa"/>
-              <w:right w:w="90" w:type="dxa"/>
-            </w:tcMar>
-            <w:tcBorders>
-              <w:left w:val="nil" w:sz="0" w:color="000000"/>
-              <w:right w:val="nil" w:sz="0" w:color="000000"/>
-              <w:top w:val="nil" w:sz="0" w:color="000000"/>
-              <w:bottom w:val="nil" w:sz="0" w:color="000000"/>
-            </w:tcBorders>
-          </w:tcPr>
-          <w:p>
-            <w:pPr>
-              <w:keepNext/>
-              <w:spacing w:before="0" w:after="0" w:line="240" w:lineRule="auto"/>
-              <w:jc w:val="center"/>
-            </w:pPr>
-            <w:r/>
-            <w:r>
-              <w:rPr>
-                <w:b w:val="0"/>
-                <w:i w:val="0"/>
-                <w:sz w:val="19"/>
-              </w:rPr>
-              <w:t>no</w:t>
-            </w:r>
-          </w:p>
-        </w:tc>
-      </w:tr>
-      <w:tr>
-        <w:trPr>
-          <w:cantSplit/>
-        </w:trPr>
-        <w:tc>
-          <w:tcPr>
-            <w:tcW w:type="dxa" w:w="2268"/>
-            <w:tcMar>
-              <w:top w:w="60" w:type="dxa"/>
-              <w:bottom w:w="60" w:type="dxa"/>
-              <w:left w:w="90" w:type="dxa"/>
-              <w:right w:w="90" w:type="dxa"/>
-            </w:tcMar>
-            <w:tcBorders>
-              <w:left w:val="nil" w:sz="0" w:color="000000"/>
-              <w:right w:val="nil" w:sz="0" w:color="000000"/>
-              <w:top w:val="nil" w:sz="0" w:color="000000"/>
-              <w:bottom w:val="nil" w:sz="0" w:color="000000"/>
-            </w:tcBorders>
-          </w:tcPr>
-          <w:p>
-            <w:pPr>
-              <w:keepNext/>
-              <w:spacing w:before="0" w:after="0" w:line="240" w:lineRule="auto"/>
-              <w:jc w:val="left"/>
-            </w:pPr>
-            <w:r/>
-            <w:r>
-              <w:rPr>
-                <w:b w:val="0"/>
-                <w:i w:val="0"/>
-                <w:sz w:val="19"/>
-              </w:rPr>
-              <w:t>B₀ = 4, ε = 0.7</w:t>
-            </w:r>
-          </w:p>
-        </w:tc>
-        <w:tc>
-          <w:tcPr>
-            <w:tcW w:type="dxa" w:w="1361"/>
-            <w:tcMar>
-              <w:top w:w="60" w:type="dxa"/>
-              <w:bottom w:w="60" w:type="dxa"/>
-              <w:left w:w="90" w:type="dxa"/>
-              <w:right w:w="90" w:type="dxa"/>
-            </w:tcMar>
-            <w:tcBorders>
-              <w:left w:val="nil" w:sz="0" w:color="000000"/>
-              <w:right w:val="nil" w:sz="0" w:color="000000"/>
-              <w:top w:val="nil" w:sz="0" w:color="000000"/>
-              <w:bottom w:val="nil" w:sz="0" w:color="000000"/>
-            </w:tcBorders>
-          </w:tcPr>
-          <w:p>
-            <w:pPr>
-              <w:keepNext/>
-              <w:spacing w:before="0" w:after="0" w:line="240" w:lineRule="auto"/>
-              <w:jc w:val="center"/>
-            </w:pPr>
-            <w:r/>
-            <w:r>
-              <w:rPr>
-                <w:b w:val="0"/>
-                <w:i w:val="0"/>
-                <w:sz w:val="19"/>
-              </w:rPr>
-              <w:t>30%</w:t>
-            </w:r>
-          </w:p>
-        </w:tc>
-        <w:tc>
-          <w:tcPr>
-            <w:tcW w:type="dxa" w:w="2268"/>
-            <w:tcMar>
-              <w:top w:w="60" w:type="dxa"/>
-              <w:bottom w:w="60" w:type="dxa"/>
-              <w:left w:w="90" w:type="dxa"/>
-              <w:right w:w="90" w:type="dxa"/>
-            </w:tcMar>
-            <w:tcBorders>
-              <w:left w:val="nil" w:sz="0" w:color="000000"/>
-              <w:right w:val="nil" w:sz="0" w:color="000000"/>
-              <w:top w:val="nil" w:sz="0" w:color="000000"/>
-              <w:bottom w:val="nil" w:sz="0" w:color="000000"/>
-            </w:tcBorders>
-          </w:tcPr>
-          <w:p>
-            <w:pPr>
-              <w:keepNext/>
-              <w:spacing w:before="0" w:after="0" w:line="240" w:lineRule="auto"/>
-              <w:jc w:val="center"/>
-            </w:pPr>
-            <w:r/>
-            <w:r>
-              <w:rPr>
-                <w:b w:val="0"/>
-                <w:i w:val="0"/>
-                <w:sz w:val="19"/>
-              </w:rPr>
-              <w:t>1.35</w:t>
-            </w:r>
-          </w:p>
-        </w:tc>
-        <w:tc>
-          <w:tcPr>
-            <w:tcW w:type="dxa" w:w="1587"/>
-            <w:tcMar>
-              <w:top w:w="60" w:type="dxa"/>
-              <w:bottom w:w="60" w:type="dxa"/>
-              <w:left w:w="90" w:type="dxa"/>
-              <w:right w:w="90" w:type="dxa"/>
-            </w:tcMar>
-            <w:tcBorders>
-              <w:left w:val="nil" w:sz="0" w:color="000000"/>
-              <w:right w:val="nil" w:sz="0" w:color="000000"/>
-              <w:top w:val="nil" w:sz="0" w:color="000000"/>
-              <w:bottom w:val="nil" w:sz="0" w:color="000000"/>
-            </w:tcBorders>
-          </w:tcPr>
-          <w:p>
-            <w:pPr>
-              <w:keepNext/>
-              <w:spacing w:before="0" w:after="0" w:line="240" w:lineRule="auto"/>
-              <w:jc w:val="center"/>
-            </w:pPr>
-            <w:r/>
-            <w:r>
-              <w:rPr>
-                <w:b w:val="0"/>
-                <w:i w:val="0"/>
-                <w:sz w:val="19"/>
-              </w:rPr>
-              <w:t>0.26</w:t>
-            </w:r>
-          </w:p>
-        </w:tc>
-        <w:tc>
-          <w:tcPr>
-            <w:tcW w:type="dxa" w:w="1247"/>
-            <w:tcMar>
-              <w:top w:w="60" w:type="dxa"/>
-              <w:bottom w:w="60" w:type="dxa"/>
-              <w:left w:w="90" w:type="dxa"/>
-              <w:right w:w="90" w:type="dxa"/>
-            </w:tcMar>
-            <w:tcBorders>
-              <w:left w:val="nil" w:sz="0" w:color="000000"/>
-              <w:right w:val="nil" w:sz="0" w:color="000000"/>
-              <w:top w:val="nil" w:sz="0" w:color="000000"/>
-              <w:bottom w:val="nil" w:sz="0" w:color="000000"/>
-            </w:tcBorders>
-          </w:tcPr>
-          <w:p>
-            <w:pPr>
-              <w:keepNext/>
-              <w:spacing w:before="0" w:after="0" w:line="240" w:lineRule="auto"/>
-              <w:jc w:val="center"/>
-            </w:pPr>
-            <w:r/>
-            <w:r>
-              <w:rPr>
-                <w:b w:val="0"/>
-                <w:i w:val="0"/>
-                <w:sz w:val="19"/>
-              </w:rPr>
-              <w:t>no</w:t>
-            </w:r>
-          </w:p>
-        </w:tc>
-      </w:tr>
-      <w:tr>
-        <w:trPr>
-          <w:cantSplit/>
-        </w:trPr>
-        <w:tc>
-          <w:tcPr>
-            <w:tcW w:type="dxa" w:w="2268"/>
-            <w:tcMar>
-              <w:top w:w="60" w:type="dxa"/>
-              <w:bottom w:w="60" w:type="dxa"/>
-              <w:left w:w="90" w:type="dxa"/>
-              <w:right w:w="90" w:type="dxa"/>
-            </w:tcMar>
-            <w:tcBorders>
-              <w:left w:val="nil" w:sz="0" w:color="000000"/>
-              <w:right w:val="nil" w:sz="0" w:color="000000"/>
-              <w:top w:val="nil" w:sz="0" w:color="000000"/>
-              <w:bottom w:val="single" w:sz="12" w:color="000000"/>
-            </w:tcBorders>
-          </w:tcPr>
-          <w:p>
-            <w:pPr>
-              <w:keepNext w:val="0"/>
-              <w:spacing w:before="0" w:after="0" w:line="240" w:lineRule="auto"/>
-              <w:jc w:val="left"/>
-            </w:pPr>
-            <w:r/>
-            <w:r>
-              <w:rPr>
-                <w:b w:val="0"/>
-                <w:i w:val="0"/>
-                <w:sz w:val="19"/>
-              </w:rPr>
-              <w:t>B₀ = 6, ε = 0.3</w:t>
-            </w:r>
-          </w:p>
-        </w:tc>
-        <w:tc>
-          <w:tcPr>
-            <w:tcW w:type="dxa" w:w="1361"/>
-            <w:tcMar>
-              <w:top w:w="60" w:type="dxa"/>
-              <w:bottom w:w="60" w:type="dxa"/>
-              <w:left w:w="90" w:type="dxa"/>
-              <w:right w:w="90" w:type="dxa"/>
-            </w:tcMar>
-            <w:tcBorders>
-              <w:left w:val="nil" w:sz="0" w:color="000000"/>
-              <w:right w:val="nil" w:sz="0" w:color="000000"/>
-              <w:top w:val="nil" w:sz="0" w:color="000000"/>
-              <w:bottom w:val="single" w:sz="12" w:color="000000"/>
-            </w:tcBorders>
-          </w:tcPr>
-          <w:p>
-            <w:pPr>
-              <w:keepNext w:val="0"/>
-              <w:spacing w:before="0" w:after="0" w:line="240" w:lineRule="auto"/>
-              <w:jc w:val="center"/>
-            </w:pPr>
-            <w:r/>
-            <w:r>
-              <w:rPr>
-                <w:b w:val="0"/>
-                <w:i w:val="0"/>
-                <w:sz w:val="19"/>
-              </w:rPr>
-              <w:t>70%</w:t>
-            </w:r>
-          </w:p>
-        </w:tc>
-        <w:tc>
-          <w:tcPr>
-            <w:tcW w:type="dxa" w:w="2268"/>
-            <w:tcMar>
-              <w:top w:w="60" w:type="dxa"/>
-              <w:bottom w:w="60" w:type="dxa"/>
-              <w:left w:w="90" w:type="dxa"/>
-              <w:right w:w="90" w:type="dxa"/>
-            </w:tcMar>
-            <w:tcBorders>
-              <w:left w:val="nil" w:sz="0" w:color="000000"/>
-              <w:right w:val="nil" w:sz="0" w:color="000000"/>
-              <w:top w:val="nil" w:sz="0" w:color="000000"/>
-              <w:bottom w:val="single" w:sz="12" w:color="000000"/>
-            </w:tcBorders>
-          </w:tcPr>
-          <w:p>
-            <w:pPr>
-              <w:keepNext w:val="0"/>
-              <w:spacing w:before="0" w:after="0" w:line="240" w:lineRule="auto"/>
-              <w:jc w:val="center"/>
-            </w:pPr>
-            <w:r/>
-            <w:r>
-              <w:rPr>
-                <w:b w:val="0"/>
-                <w:i w:val="0"/>
-                <w:sz w:val="19"/>
-              </w:rPr>
-              <w:t>23.6</w:t>
-            </w:r>
-          </w:p>
-        </w:tc>
-        <w:tc>
-          <w:tcPr>
-            <w:tcW w:type="dxa" w:w="1587"/>
-            <w:tcMar>
-              <w:top w:w="60" w:type="dxa"/>
-              <w:bottom w:w="60" w:type="dxa"/>
-              <w:left w:w="90" w:type="dxa"/>
-              <w:right w:w="90" w:type="dxa"/>
-            </w:tcMar>
-            <w:tcBorders>
-              <w:left w:val="nil" w:sz="0" w:color="000000"/>
-              <w:right w:val="nil" w:sz="0" w:color="000000"/>
-              <w:top w:val="nil" w:sz="0" w:color="000000"/>
-              <w:bottom w:val="single" w:sz="12" w:color="000000"/>
-            </w:tcBorders>
-          </w:tcPr>
-          <w:p>
-            <w:pPr>
-              <w:keepNext w:val="0"/>
-              <w:spacing w:before="0" w:after="0" w:line="240" w:lineRule="auto"/>
-              <w:jc w:val="center"/>
-            </w:pPr>
-            <w:r/>
-            <w:r>
-              <w:rPr>
-                <w:b w:val="0"/>
-                <w:i w:val="0"/>
-                <w:sz w:val="19"/>
-              </w:rPr>
-              <w:t>0.24</w:t>
-            </w:r>
-          </w:p>
-        </w:tc>
-        <w:tc>
-          <w:tcPr>
-            <w:tcW w:type="dxa" w:w="1247"/>
-            <w:tcMar>
-              <w:top w:w="60" w:type="dxa"/>
-              <w:bottom w:w="60" w:type="dxa"/>
-              <w:left w:w="90" w:type="dxa"/>
-              <w:right w:w="90" w:type="dxa"/>
-            </w:tcMar>
-            <w:tcBorders>
-              <w:left w:val="nil" w:sz="0" w:color="000000"/>
-              <w:right w:val="nil" w:sz="0" w:color="000000"/>
-              <w:top w:val="nil" w:sz="0" w:color="000000"/>
-              <w:bottom w:val="single" w:sz="12" w:color="000000"/>
-            </w:tcBorders>
-          </w:tcPr>
-          <w:p>
-            <w:pPr>
-              <w:keepNext w:val="0"/>
-              <w:spacing w:before="0" w:after="0" w:line="240" w:lineRule="auto"/>
-              <w:jc w:val="center"/>
-            </w:pPr>
-            <w:r/>
-            <w:r>
-              <w:rPr>
-                <w:b w:val="0"/>
-                <w:i w:val="0"/>
-                <w:sz w:val="19"/>
-              </w:rPr>
-              <w:t>no</w:t>
-            </w:r>
-          </w:p>
-        </w:tc>
-      </w:tr>
-    </w:tbl>
-    <w:p>
-      <w:pPr>
-        <w:spacing w:after="200"/>
-      </w:pPr>
-    </w:p>
-    <w:p>
-      <w:pPr>
-        <w:sectPr>
-          <w:type w:val="continuous"/>
-          <w:pgSz w:w="11906" w:h="16838"/>
-          <w:pgMar w:top="1304" w:right="1247" w:bottom="1304" w:left="1247" w:header="720" w:footer="720" w:gutter="0"/>
-          <w:docGrid w:linePitch="360"/>
-          <w:cols w:num="1" w:space="453"/>
-        </w:sectPr>
-      </w:pPr>
-    </w:p>
-    <w:p>
-      <w:pPr>
         <w:pStyle w:val="Heading2"/>
       </w:pPr>
       <w:r>
@@ -4270,7 +2676,7 @@
           <w:i w:val="0"/>
           <w:sz w:val="18"/>
         </w:rPr>
-        <w:t>Figure 9. Density (left) and vorticity (right) at t = 0.8 for the hydrodynamic run (top), 10% stripes B₀ = 3.5, ε = 0.9 (middle) and deep stripes B₀ = 6, ε = 0.3 (bottom). The bands in the bottom-right panel are field-aligned shear layers between bars and gaps.</w:t>
+        <w:t>Figure 9. Density (left) and vorticity (right) at t = 0.8 for the hydrodynamic run (top), stripes with 10% field contrast, B₀ = 3.5, ε = 0.9 (middle) and deep stripes B₀ = 6, ε = 0.3 (bottom). The bands in the bottom-right panel are field-aligned shear layers between bars and gaps.</w:t>
       </w:r>
     </w:p>
     <w:p>
@@ -4568,7 +2974,7 @@
         <w:pStyle w:val="Heading2"/>
       </w:pPr>
       <w:r>
-        <w:t>4.6 Resolution sensitivity</w:t>
+        <w:t>4.6 Resolution and grid convergence</w:t>
       </w:r>
     </w:p>
     <w:p>
@@ -4580,7 +2986,7 @@
           <w:b w:val="0"/>
           <w:i w:val="0"/>
         </w:rPr>
-        <w:t>The hydrodynamic reference is converged: doubling the cells in y changes a₄(0.8) from 0.137 to 0.143. Deep-stripe cases are not (Fig. 12). For k</w:t>
+        <w:t>Doubling the cells in y changes the hydrodynamic a₄(0.8) only from 0.137 to 0.143. Deep-stripe cases are more sensitive (Fig. 12). For k</w:t>
       </w:r>
       <w:r>
         <w:rPr>
@@ -4727,6 +3133,1665 @@
     </w:p>
     <w:p>
       <w:pPr>
+        <w:jc w:val="both"/>
+      </w:pPr>
+      <w:r>
+        <w:rPr>
+          <w:b w:val="0"/>
+          <w:i w:val="0"/>
+        </w:rPr>
+        <w:t>To test the base-resolution lock boundary, the cases nearest it were rerun at two and four times the resolution (800 × 200 and 1600 × 400 cells; Fig. 13, Table 2). Under the original criterion every case locks at the finer grids, including 20% field contrast, and the enstrophy ratios roughly halve with each refinement. The cause is the reference rather than the stripes: the mixing-layer enstrophy of the hydrodynamic run grows from 9.7 to 23.9 to 61.6, because without physical viscosity the inviscid mixing layer keeps forming finer vortices, while the striped runs stay between 1.1 and 4.5 at all resolutions. An enstrophy threshold measured against the hydrodynamic run therefore cannot converge.</w:t>
+      </w:r>
+    </w:p>
+    <w:p>
+      <w:pPr>
+        <w:jc w:val="both"/>
+      </w:pPr>
+      <w:r>
+        <w:rPr>
+          <w:b w:val="0"/>
+          <w:i w:val="0"/>
+        </w:rPr>
+        <w:t>The interface roughness does converge. The hydrodynamic value changes from 0.132 to 0.140 between the two finest grids, and the striped values by at most 4%; relative to the hydrodynamic run they settle at 0.20, 0.25 and 0.32 for increasing contrast. The stripe-scale mode is proportional to the magnetic-pressure contrast at every resolution, a₈ = κΔP</w:t>
+      </w:r>
+      <w:r>
+        <w:rPr>
+          <w:b w:val="0"/>
+          <w:i w:val="0"/>
+          <w:vertAlign w:val="subscript"/>
+        </w:rPr>
+        <w:t>B</w:t>
+      </w:r>
+      <w:r>
+        <w:rPr>
+          <w:b w:val="0"/>
+          <w:i w:val="0"/>
+        </w:rPr>
+        <w:t>, with κ = 0.0176, 0.0250 and 0.0270 at the three grids. Richardson extrapolation of κ (observed order 1.9) gives κ ≈ 0.028. This linear law, not a threshold, is the converged statement of the trade-off: the interface deformation produced by the stripes scales with the contrast that makes them collimate.</w:t>
+      </w:r>
+    </w:p>
+    <w:p>
+      <w:pPr>
+        <w:sectPr>
+          <w:type w:val="continuous"/>
+          <w:pgSz w:w="11906" w:h="16838"/>
+          <w:pgMar w:top="1304" w:right="1247" w:bottom="1304" w:left="1247" w:header="720" w:footer="720" w:gutter="0"/>
+          <w:docGrid w:linePitch="360"/>
+          <w:cols w:num="2" w:space="453"/>
+        </w:sectPr>
+      </w:pPr>
+    </w:p>
+    <w:p>
+      <w:pPr>
+        <w:keepNext/>
+        <w:spacing w:before="280" w:after="120"/>
+        <w:jc w:val="center"/>
+      </w:pPr>
+      <w:r>
+        <w:drawing>
+          <wp:inline xmlns:a="http://schemas.openxmlformats.org/drawingml/2006/main" xmlns:pic="http://schemas.openxmlformats.org/drawingml/2006/picture">
+            <wp:extent cx="5688000" cy="1933222"/>
+            <wp:docPr id="13" name="Picture 13"/>
+            <wp:cNvGraphicFramePr>
+              <a:graphicFrameLocks noChangeAspect="1"/>
+            </wp:cNvGraphicFramePr>
+            <a:graphic>
+              <a:graphicData uri="http://schemas.openxmlformats.org/drawingml/2006/picture">
+                <pic:pic>
+                  <pic:nvPicPr>
+                    <pic:cNvPr id="0" name="fig13_convergence.png"/>
+                    <pic:cNvPicPr/>
+                  </pic:nvPicPr>
+                  <pic:blipFill>
+                    <a:blip r:embed="rId21"/>
+                    <a:stretch>
+                      <a:fillRect/>
+                    </a:stretch>
+                  </pic:blipFill>
+                  <pic:spPr>
+                    <a:xfrm>
+                      <a:off x="0" y="0"/>
+                      <a:ext cx="5688000" cy="1933222"/>
+                    </a:xfrm>
+                    <a:prstGeom prst="rect"/>
+                  </pic:spPr>
+                </pic:pic>
+              </a:graphicData>
+            </a:graphic>
+          </wp:inline>
+        </w:drawing>
+      </w:r>
+    </w:p>
+    <w:p>
+      <w:pPr>
+        <w:spacing w:after="320" w:line="276" w:lineRule="auto"/>
+        <w:ind w:left="567" w:right="567"/>
+        <w:jc w:val="both"/>
+      </w:pPr>
+      <w:r>
+        <w:rPr>
+          <w:b w:val="0"/>
+          <w:i w:val="0"/>
+          <w:sz w:val="18"/>
+        </w:rPr>
+        <w:t>Figure 13. Grid convergence at 1×, 2× and 4× the base resolution. (a) Mixing-layer enstrophy: the hydrodynamic value keeps growing, the striped values do not. (b) Interface roughness, which converges. (c) Stripe-scale amplitude a₈ against the bar-gap magnetic-pressure contrast, with the least-squares line a₈ = κΔP</w:t>
+      </w:r>
+      <w:r>
+        <w:rPr>
+          <w:b w:val="0"/>
+          <w:i w:val="0"/>
+          <w:sz w:val="18"/>
+          <w:vertAlign w:val="subscript"/>
+        </w:rPr>
+        <w:t>B</w:t>
+      </w:r>
+      <w:r>
+        <w:rPr>
+          <w:b w:val="0"/>
+          <w:i w:val="0"/>
+          <w:sz w:val="18"/>
+        </w:rPr>
+        <w:t xml:space="preserve"> at each resolution. The uniform field and B₀ = 3 were not run at 4×.</w:t>
+      </w:r>
+    </w:p>
+    <w:p>
+      <w:pPr>
+        <w:sectPr>
+          <w:type w:val="continuous"/>
+          <w:pgSz w:w="11906" w:h="16838"/>
+          <w:pgMar w:top="1304" w:right="1247" w:bottom="1304" w:left="1247" w:header="720" w:footer="720" w:gutter="0"/>
+          <w:docGrid w:linePitch="360"/>
+          <w:cols w:num="1" w:space="453"/>
+        </w:sectPr>
+      </w:pPr>
+    </w:p>
+    <w:p>
+      <w:pPr>
+        <w:sectPr>
+          <w:type w:val="continuous"/>
+          <w:pgSz w:w="11906" w:h="16838"/>
+          <w:pgMar w:top="1304" w:right="1247" w:bottom="1304" w:left="1247" w:header="720" w:footer="720" w:gutter="0"/>
+          <w:docGrid w:linePitch="360"/>
+          <w:cols w:num="2" w:space="453"/>
+        </w:sectPr>
+      </w:pPr>
+    </w:p>
+    <w:p>
+      <w:pPr>
+        <w:keepNext/>
+        <w:spacing w:before="240" w:after="100"/>
+        <w:ind w:left="312"/>
+        <w:jc w:val="left"/>
+      </w:pPr>
+      <w:r>
+        <w:rPr>
+          <w:b/>
+          <w:i w:val="0"/>
+          <w:sz w:val="19"/>
+        </w:rPr>
+        <w:t>Table 2.</w:t>
+      </w:r>
+      <w:r>
+        <w:rPr>
+          <w:b w:val="0"/>
+          <w:i w:val="0"/>
+          <w:sz w:val="19"/>
+        </w:rPr>
+        <w:t xml:space="preserve"> </w:t>
+      </w:r>
+      <w:r>
+        <w:rPr>
+          <w:b w:val="0"/>
+          <w:i w:val="0"/>
+          <w:sz w:val="19"/>
+        </w:rPr>
+        <w:t>Interface roughness relative to the hydrodynamic run and stripe-scale amplitude at t = 0.8, at three resolutions. Dashes: not run at that resolution.</w:t>
+      </w:r>
+    </w:p>
+    <w:tbl>
+      <w:tblPr>
+        <w:tblW w:type="auto" w:w="0"/>
+        <w:jc w:val="center"/>
+        <w:tblLayout w:type="fixed"/>
+        <w:tblLook w:firstColumn="1" w:firstRow="1" w:lastColumn="0" w:lastRow="0" w:noHBand="0" w:noVBand="1" w:val="04A0"/>
+      </w:tblPr>
+      <w:tblGrid>
+        <w:gridCol w:w="1345"/>
+        <w:gridCol w:w="1345"/>
+        <w:gridCol w:w="1345"/>
+        <w:gridCol w:w="1345"/>
+        <w:gridCol w:w="1345"/>
+        <w:gridCol w:w="1345"/>
+        <w:gridCol w:w="1345"/>
+      </w:tblGrid>
+      <w:tr>
+        <w:trPr>
+          <w:cantSplit/>
+        </w:trPr>
+        <w:tc>
+          <w:tcPr>
+            <w:tcW w:type="dxa" w:w="1701"/>
+            <w:tcMar>
+              <w:top w:w="60" w:type="dxa"/>
+              <w:bottom w:w="60" w:type="dxa"/>
+              <w:left w:w="90" w:type="dxa"/>
+              <w:right w:w="90" w:type="dxa"/>
+            </w:tcMar>
+            <w:shd w:val="clear" w:color="auto" w:fill="EFEFEF"/>
+            <w:tcBorders>
+              <w:left w:val="nil" w:sz="0" w:color="000000"/>
+              <w:right w:val="nil" w:sz="0" w:color="000000"/>
+              <w:top w:val="single" w:sz="12" w:color="000000"/>
+              <w:bottom w:val="single" w:sz="6" w:color="000000"/>
+            </w:tcBorders>
+          </w:tcPr>
+          <w:p>
+            <w:pPr>
+              <w:keepNext/>
+              <w:spacing w:before="0" w:after="0" w:line="240" w:lineRule="auto"/>
+              <w:jc w:val="left"/>
+            </w:pPr>
+            <w:r/>
+            <w:r>
+              <w:rPr>
+                <w:b/>
+                <w:i w:val="0"/>
+                <w:sz w:val="19"/>
+              </w:rPr>
+              <w:t>Field (B₀, ε)</w:t>
+            </w:r>
+          </w:p>
+        </w:tc>
+        <w:tc>
+          <w:tcPr>
+            <w:tcW w:type="dxa" w:w="907"/>
+            <w:tcMar>
+              <w:top w:w="60" w:type="dxa"/>
+              <w:bottom w:w="60" w:type="dxa"/>
+              <w:left w:w="90" w:type="dxa"/>
+              <w:right w:w="90" w:type="dxa"/>
+            </w:tcMar>
+            <w:shd w:val="clear" w:color="auto" w:fill="EFEFEF"/>
+            <w:tcBorders>
+              <w:left w:val="nil" w:sz="0" w:color="000000"/>
+              <w:right w:val="nil" w:sz="0" w:color="000000"/>
+              <w:top w:val="single" w:sz="12" w:color="000000"/>
+              <w:bottom w:val="single" w:sz="6" w:color="000000"/>
+            </w:tcBorders>
+          </w:tcPr>
+          <w:p>
+            <w:pPr>
+              <w:keepNext/>
+              <w:spacing w:before="0" w:after="0" w:line="240" w:lineRule="auto"/>
+              <w:jc w:val="center"/>
+            </w:pPr>
+            <w:r/>
+            <w:r>
+              <w:rPr>
+                <w:b/>
+                <w:i w:val="0"/>
+                <w:sz w:val="19"/>
+              </w:rPr>
+              <w:t>ΔP</w:t>
+            </w:r>
+            <w:r>
+              <w:rPr>
+                <w:b/>
+                <w:i w:val="0"/>
+                <w:sz w:val="19"/>
+                <w:vertAlign w:val="subscript"/>
+              </w:rPr>
+              <w:t>B</w:t>
+            </w:r>
+          </w:p>
+        </w:tc>
+        <w:tc>
+          <w:tcPr>
+            <w:tcW w:type="dxa" w:w="1361"/>
+            <w:tcMar>
+              <w:top w:w="60" w:type="dxa"/>
+              <w:bottom w:w="60" w:type="dxa"/>
+              <w:left w:w="90" w:type="dxa"/>
+              <w:right w:w="90" w:type="dxa"/>
+            </w:tcMar>
+            <w:shd w:val="clear" w:color="auto" w:fill="EFEFEF"/>
+            <w:tcBorders>
+              <w:left w:val="nil" w:sz="0" w:color="000000"/>
+              <w:right w:val="nil" w:sz="0" w:color="000000"/>
+              <w:top w:val="single" w:sz="12" w:color="000000"/>
+              <w:bottom w:val="single" w:sz="6" w:color="000000"/>
+            </w:tcBorders>
+          </w:tcPr>
+          <w:p>
+            <w:pPr>
+              <w:keepNext/>
+              <w:spacing w:before="0" w:after="0" w:line="240" w:lineRule="auto"/>
+              <w:jc w:val="center"/>
+            </w:pPr>
+            <w:r/>
+            <w:r>
+              <w:rPr>
+                <w:b/>
+                <w:i w:val="0"/>
+                <w:sz w:val="19"/>
+              </w:rPr>
+              <w:t>rough./hydro 1×</w:t>
+            </w:r>
+          </w:p>
+        </w:tc>
+        <w:tc>
+          <w:tcPr>
+            <w:tcW w:type="dxa" w:w="1020"/>
+            <w:tcMar>
+              <w:top w:w="60" w:type="dxa"/>
+              <w:bottom w:w="60" w:type="dxa"/>
+              <w:left w:w="90" w:type="dxa"/>
+              <w:right w:w="90" w:type="dxa"/>
+            </w:tcMar>
+            <w:shd w:val="clear" w:color="auto" w:fill="EFEFEF"/>
+            <w:tcBorders>
+              <w:left w:val="nil" w:sz="0" w:color="000000"/>
+              <w:right w:val="nil" w:sz="0" w:color="000000"/>
+              <w:top w:val="single" w:sz="12" w:color="000000"/>
+              <w:bottom w:val="single" w:sz="6" w:color="000000"/>
+            </w:tcBorders>
+          </w:tcPr>
+          <w:p>
+            <w:pPr>
+              <w:keepNext/>
+              <w:spacing w:before="0" w:after="0" w:line="240" w:lineRule="auto"/>
+              <w:jc w:val="center"/>
+            </w:pPr>
+            <w:r/>
+            <w:r>
+              <w:rPr>
+                <w:b/>
+                <w:i w:val="0"/>
+                <w:sz w:val="19"/>
+              </w:rPr>
+              <w:t>2×</w:t>
+            </w:r>
+          </w:p>
+        </w:tc>
+        <w:tc>
+          <w:tcPr>
+            <w:tcW w:type="dxa" w:w="1020"/>
+            <w:tcMar>
+              <w:top w:w="60" w:type="dxa"/>
+              <w:bottom w:w="60" w:type="dxa"/>
+              <w:left w:w="90" w:type="dxa"/>
+              <w:right w:w="90" w:type="dxa"/>
+            </w:tcMar>
+            <w:shd w:val="clear" w:color="auto" w:fill="EFEFEF"/>
+            <w:tcBorders>
+              <w:left w:val="nil" w:sz="0" w:color="000000"/>
+              <w:right w:val="nil" w:sz="0" w:color="000000"/>
+              <w:top w:val="single" w:sz="12" w:color="000000"/>
+              <w:bottom w:val="single" w:sz="6" w:color="000000"/>
+            </w:tcBorders>
+          </w:tcPr>
+          <w:p>
+            <w:pPr>
+              <w:keepNext/>
+              <w:spacing w:before="0" w:after="0" w:line="240" w:lineRule="auto"/>
+              <w:jc w:val="center"/>
+            </w:pPr>
+            <w:r/>
+            <w:r>
+              <w:rPr>
+                <w:b/>
+                <w:i w:val="0"/>
+                <w:sz w:val="19"/>
+              </w:rPr>
+              <w:t>4×</w:t>
+            </w:r>
+          </w:p>
+        </w:tc>
+        <w:tc>
+          <w:tcPr>
+            <w:tcW w:type="dxa" w:w="1247"/>
+            <w:tcMar>
+              <w:top w:w="60" w:type="dxa"/>
+              <w:bottom w:w="60" w:type="dxa"/>
+              <w:left w:w="90" w:type="dxa"/>
+              <w:right w:w="90" w:type="dxa"/>
+            </w:tcMar>
+            <w:shd w:val="clear" w:color="auto" w:fill="EFEFEF"/>
+            <w:tcBorders>
+              <w:left w:val="nil" w:sz="0" w:color="000000"/>
+              <w:right w:val="nil" w:sz="0" w:color="000000"/>
+              <w:top w:val="single" w:sz="12" w:color="000000"/>
+              <w:bottom w:val="single" w:sz="6" w:color="000000"/>
+            </w:tcBorders>
+          </w:tcPr>
+          <w:p>
+            <w:pPr>
+              <w:keepNext/>
+              <w:spacing w:before="0" w:after="0" w:line="240" w:lineRule="auto"/>
+              <w:jc w:val="center"/>
+            </w:pPr>
+            <w:r/>
+            <w:r>
+              <w:rPr>
+                <w:b/>
+                <w:i w:val="0"/>
+                <w:sz w:val="19"/>
+              </w:rPr>
+              <w:t>a₈ (4×)</w:t>
+            </w:r>
+          </w:p>
+        </w:tc>
+        <w:tc>
+          <w:tcPr>
+            <w:tcW w:type="dxa" w:w="1531"/>
+            <w:tcMar>
+              <w:top w:w="60" w:type="dxa"/>
+              <w:bottom w:w="60" w:type="dxa"/>
+              <w:left w:w="90" w:type="dxa"/>
+              <w:right w:w="90" w:type="dxa"/>
+            </w:tcMar>
+            <w:shd w:val="clear" w:color="auto" w:fill="EFEFEF"/>
+            <w:tcBorders>
+              <w:left w:val="nil" w:sz="0" w:color="000000"/>
+              <w:right w:val="nil" w:sz="0" w:color="000000"/>
+              <w:top w:val="single" w:sz="12" w:color="000000"/>
+              <w:bottom w:val="single" w:sz="6" w:color="000000"/>
+            </w:tcBorders>
+          </w:tcPr>
+          <w:p>
+            <w:pPr>
+              <w:keepNext/>
+              <w:spacing w:before="0" w:after="0" w:line="240" w:lineRule="auto"/>
+              <w:jc w:val="center"/>
+            </w:pPr>
+            <w:r/>
+            <w:r>
+              <w:rPr>
+                <w:b/>
+                <w:i w:val="0"/>
+                <w:sz w:val="19"/>
+              </w:rPr>
+              <w:t>a₈/ΔP</w:t>
+            </w:r>
+            <w:r>
+              <w:rPr>
+                <w:b/>
+                <w:i w:val="0"/>
+                <w:sz w:val="19"/>
+                <w:vertAlign w:val="subscript"/>
+              </w:rPr>
+              <w:t>B</w:t>
+            </w:r>
+            <w:r>
+              <w:rPr>
+                <w:b/>
+                <w:i w:val="0"/>
+                <w:sz w:val="19"/>
+              </w:rPr>
+              <w:t xml:space="preserve"> (4×)</w:t>
+            </w:r>
+          </w:p>
+        </w:tc>
+      </w:tr>
+      <w:tr>
+        <w:trPr>
+          <w:cantSplit/>
+        </w:trPr>
+        <w:tc>
+          <w:tcPr>
+            <w:tcW w:type="dxa" w:w="1701"/>
+            <w:tcMar>
+              <w:top w:w="60" w:type="dxa"/>
+              <w:bottom w:w="60" w:type="dxa"/>
+              <w:left w:w="90" w:type="dxa"/>
+              <w:right w:w="90" w:type="dxa"/>
+            </w:tcMar>
+            <w:tcBorders>
+              <w:left w:val="nil" w:sz="0" w:color="000000"/>
+              <w:right w:val="nil" w:sz="0" w:color="000000"/>
+              <w:top w:val="nil" w:sz="0" w:color="000000"/>
+              <w:bottom w:val="nil" w:sz="0" w:color="000000"/>
+            </w:tcBorders>
+          </w:tcPr>
+          <w:p>
+            <w:pPr>
+              <w:keepNext/>
+              <w:spacing w:before="0" w:after="0" w:line="240" w:lineRule="auto"/>
+              <w:jc w:val="left"/>
+            </w:pPr>
+            <w:r/>
+            <w:r>
+              <w:rPr>
+                <w:b w:val="0"/>
+                <w:i w:val="0"/>
+                <w:sz w:val="19"/>
+              </w:rPr>
+              <w:t>uniform, B = 3</w:t>
+            </w:r>
+          </w:p>
+        </w:tc>
+        <w:tc>
+          <w:tcPr>
+            <w:tcW w:type="dxa" w:w="907"/>
+            <w:tcMar>
+              <w:top w:w="60" w:type="dxa"/>
+              <w:bottom w:w="60" w:type="dxa"/>
+              <w:left w:w="90" w:type="dxa"/>
+              <w:right w:w="90" w:type="dxa"/>
+            </w:tcMar>
+            <w:tcBorders>
+              <w:left w:val="nil" w:sz="0" w:color="000000"/>
+              <w:right w:val="nil" w:sz="0" w:color="000000"/>
+              <w:top w:val="nil" w:sz="0" w:color="000000"/>
+              <w:bottom w:val="nil" w:sz="0" w:color="000000"/>
+            </w:tcBorders>
+          </w:tcPr>
+          <w:p>
+            <w:pPr>
+              <w:keepNext/>
+              <w:spacing w:before="0" w:after="0" w:line="240" w:lineRule="auto"/>
+              <w:jc w:val="center"/>
+            </w:pPr>
+            <w:r/>
+            <w:r>
+              <w:rPr>
+                <w:b w:val="0"/>
+                <w:i w:val="0"/>
+                <w:sz w:val="19"/>
+              </w:rPr>
+              <w:t>0.09</w:t>
+            </w:r>
+          </w:p>
+        </w:tc>
+        <w:tc>
+          <w:tcPr>
+            <w:tcW w:type="dxa" w:w="1361"/>
+            <w:tcMar>
+              <w:top w:w="60" w:type="dxa"/>
+              <w:bottom w:w="60" w:type="dxa"/>
+              <w:left w:w="90" w:type="dxa"/>
+              <w:right w:w="90" w:type="dxa"/>
+            </w:tcMar>
+            <w:tcBorders>
+              <w:left w:val="nil" w:sz="0" w:color="000000"/>
+              <w:right w:val="nil" w:sz="0" w:color="000000"/>
+              <w:top w:val="nil" w:sz="0" w:color="000000"/>
+              <w:bottom w:val="nil" w:sz="0" w:color="000000"/>
+            </w:tcBorders>
+          </w:tcPr>
+          <w:p>
+            <w:pPr>
+              <w:keepNext/>
+              <w:spacing w:before="0" w:after="0" w:line="240" w:lineRule="auto"/>
+              <w:jc w:val="center"/>
+            </w:pPr>
+            <w:r/>
+            <w:r>
+              <w:rPr>
+                <w:b w:val="0"/>
+                <w:i w:val="0"/>
+                <w:sz w:val="19"/>
+              </w:rPr>
+              <w:t>0.274</w:t>
+            </w:r>
+          </w:p>
+        </w:tc>
+        <w:tc>
+          <w:tcPr>
+            <w:tcW w:type="dxa" w:w="1020"/>
+            <w:tcMar>
+              <w:top w:w="60" w:type="dxa"/>
+              <w:bottom w:w="60" w:type="dxa"/>
+              <w:left w:w="90" w:type="dxa"/>
+              <w:right w:w="90" w:type="dxa"/>
+            </w:tcMar>
+            <w:tcBorders>
+              <w:left w:val="nil" w:sz="0" w:color="000000"/>
+              <w:right w:val="nil" w:sz="0" w:color="000000"/>
+              <w:top w:val="nil" w:sz="0" w:color="000000"/>
+              <w:bottom w:val="nil" w:sz="0" w:color="000000"/>
+            </w:tcBorders>
+          </w:tcPr>
+          <w:p>
+            <w:pPr>
+              <w:keepNext/>
+              <w:spacing w:before="0" w:after="0" w:line="240" w:lineRule="auto"/>
+              <w:jc w:val="center"/>
+            </w:pPr>
+            <w:r/>
+            <w:r>
+              <w:rPr>
+                <w:b w:val="0"/>
+                <w:i w:val="0"/>
+                <w:sz w:val="19"/>
+              </w:rPr>
+              <w:t>0.158</w:t>
+            </w:r>
+          </w:p>
+        </w:tc>
+        <w:tc>
+          <w:tcPr>
+            <w:tcW w:type="dxa" w:w="1020"/>
+            <w:tcMar>
+              <w:top w:w="60" w:type="dxa"/>
+              <w:bottom w:w="60" w:type="dxa"/>
+              <w:left w:w="90" w:type="dxa"/>
+              <w:right w:w="90" w:type="dxa"/>
+            </w:tcMar>
+            <w:tcBorders>
+              <w:left w:val="nil" w:sz="0" w:color="000000"/>
+              <w:right w:val="nil" w:sz="0" w:color="000000"/>
+              <w:top w:val="nil" w:sz="0" w:color="000000"/>
+              <w:bottom w:val="nil" w:sz="0" w:color="000000"/>
+            </w:tcBorders>
+          </w:tcPr>
+          <w:p>
+            <w:pPr>
+              <w:keepNext/>
+              <w:spacing w:before="0" w:after="0" w:line="240" w:lineRule="auto"/>
+              <w:jc w:val="center"/>
+            </w:pPr>
+            <w:r/>
+            <w:r>
+              <w:rPr>
+                <w:b w:val="0"/>
+                <w:i w:val="0"/>
+                <w:sz w:val="19"/>
+              </w:rPr>
+              <w:t>-</w:t>
+            </w:r>
+          </w:p>
+        </w:tc>
+        <w:tc>
+          <w:tcPr>
+            <w:tcW w:type="dxa" w:w="1247"/>
+            <w:tcMar>
+              <w:top w:w="60" w:type="dxa"/>
+              <w:bottom w:w="60" w:type="dxa"/>
+              <w:left w:w="90" w:type="dxa"/>
+              <w:right w:w="90" w:type="dxa"/>
+            </w:tcMar>
+            <w:tcBorders>
+              <w:left w:val="nil" w:sz="0" w:color="000000"/>
+              <w:right w:val="nil" w:sz="0" w:color="000000"/>
+              <w:top w:val="nil" w:sz="0" w:color="000000"/>
+              <w:bottom w:val="nil" w:sz="0" w:color="000000"/>
+            </w:tcBorders>
+          </w:tcPr>
+          <w:p>
+            <w:pPr>
+              <w:keepNext/>
+              <w:spacing w:before="0" w:after="0" w:line="240" w:lineRule="auto"/>
+              <w:jc w:val="center"/>
+            </w:pPr>
+            <w:r/>
+            <w:r>
+              <w:rPr>
+                <w:b w:val="0"/>
+                <w:i w:val="0"/>
+                <w:sz w:val="19"/>
+              </w:rPr>
+              <w:t>-</w:t>
+            </w:r>
+          </w:p>
+        </w:tc>
+        <w:tc>
+          <w:tcPr>
+            <w:tcW w:type="dxa" w:w="1531"/>
+            <w:tcMar>
+              <w:top w:w="60" w:type="dxa"/>
+              <w:bottom w:w="60" w:type="dxa"/>
+              <w:left w:w="90" w:type="dxa"/>
+              <w:right w:w="90" w:type="dxa"/>
+            </w:tcMar>
+            <w:tcBorders>
+              <w:left w:val="nil" w:sz="0" w:color="000000"/>
+              <w:right w:val="nil" w:sz="0" w:color="000000"/>
+              <w:top w:val="nil" w:sz="0" w:color="000000"/>
+              <w:bottom w:val="nil" w:sz="0" w:color="000000"/>
+            </w:tcBorders>
+          </w:tcPr>
+          <w:p>
+            <w:pPr>
+              <w:keepNext/>
+              <w:spacing w:before="0" w:after="0" w:line="240" w:lineRule="auto"/>
+              <w:jc w:val="center"/>
+            </w:pPr>
+            <w:r/>
+            <w:r>
+              <w:rPr>
+                <w:b w:val="0"/>
+                <w:i w:val="0"/>
+                <w:sz w:val="19"/>
+              </w:rPr>
+              <w:t>-</w:t>
+            </w:r>
+          </w:p>
+        </w:tc>
+      </w:tr>
+      <w:tr>
+        <w:trPr>
+          <w:cantSplit/>
+        </w:trPr>
+        <w:tc>
+          <w:tcPr>
+            <w:tcW w:type="dxa" w:w="1701"/>
+            <w:tcMar>
+              <w:top w:w="60" w:type="dxa"/>
+              <w:bottom w:w="60" w:type="dxa"/>
+              <w:left w:w="90" w:type="dxa"/>
+              <w:right w:w="90" w:type="dxa"/>
+            </w:tcMar>
+            <w:tcBorders>
+              <w:left w:val="nil" w:sz="0" w:color="000000"/>
+              <w:right w:val="nil" w:sz="0" w:color="000000"/>
+              <w:top w:val="nil" w:sz="0" w:color="000000"/>
+              <w:bottom w:val="nil" w:sz="0" w:color="000000"/>
+            </w:tcBorders>
+          </w:tcPr>
+          <w:p>
+            <w:pPr>
+              <w:keepNext/>
+              <w:spacing w:before="0" w:after="0" w:line="240" w:lineRule="auto"/>
+              <w:jc w:val="left"/>
+            </w:pPr>
+            <w:r/>
+            <w:r>
+              <w:rPr>
+                <w:b w:val="0"/>
+                <w:i w:val="0"/>
+                <w:sz w:val="19"/>
+              </w:rPr>
+              <w:t>3, 0.9</w:t>
+            </w:r>
+          </w:p>
+        </w:tc>
+        <w:tc>
+          <w:tcPr>
+            <w:tcW w:type="dxa" w:w="907"/>
+            <w:tcMar>
+              <w:top w:w="60" w:type="dxa"/>
+              <w:bottom w:w="60" w:type="dxa"/>
+              <w:left w:w="90" w:type="dxa"/>
+              <w:right w:w="90" w:type="dxa"/>
+            </w:tcMar>
+            <w:tcBorders>
+              <w:left w:val="nil" w:sz="0" w:color="000000"/>
+              <w:right w:val="nil" w:sz="0" w:color="000000"/>
+              <w:top w:val="nil" w:sz="0" w:color="000000"/>
+              <w:bottom w:val="nil" w:sz="0" w:color="000000"/>
+            </w:tcBorders>
+          </w:tcPr>
+          <w:p>
+            <w:pPr>
+              <w:keepNext/>
+              <w:spacing w:before="0" w:after="0" w:line="240" w:lineRule="auto"/>
+              <w:jc w:val="center"/>
+            </w:pPr>
+            <w:r/>
+            <w:r>
+              <w:rPr>
+                <w:b w:val="0"/>
+                <w:i w:val="0"/>
+                <w:sz w:val="19"/>
+              </w:rPr>
+              <w:t>0.86</w:t>
+            </w:r>
+          </w:p>
+        </w:tc>
+        <w:tc>
+          <w:tcPr>
+            <w:tcW w:type="dxa" w:w="1361"/>
+            <w:tcMar>
+              <w:top w:w="60" w:type="dxa"/>
+              <w:bottom w:w="60" w:type="dxa"/>
+              <w:left w:w="90" w:type="dxa"/>
+              <w:right w:w="90" w:type="dxa"/>
+            </w:tcMar>
+            <w:tcBorders>
+              <w:left w:val="nil" w:sz="0" w:color="000000"/>
+              <w:right w:val="nil" w:sz="0" w:color="000000"/>
+              <w:top w:val="nil" w:sz="0" w:color="000000"/>
+              <w:bottom w:val="nil" w:sz="0" w:color="000000"/>
+            </w:tcBorders>
+          </w:tcPr>
+          <w:p>
+            <w:pPr>
+              <w:keepNext/>
+              <w:spacing w:before="0" w:after="0" w:line="240" w:lineRule="auto"/>
+              <w:jc w:val="center"/>
+            </w:pPr>
+            <w:r/>
+            <w:r>
+              <w:rPr>
+                <w:b w:val="0"/>
+                <w:i w:val="0"/>
+                <w:sz w:val="19"/>
+              </w:rPr>
+              <w:t>0.310</w:t>
+            </w:r>
+          </w:p>
+        </w:tc>
+        <w:tc>
+          <w:tcPr>
+            <w:tcW w:type="dxa" w:w="1020"/>
+            <w:tcMar>
+              <w:top w:w="60" w:type="dxa"/>
+              <w:bottom w:w="60" w:type="dxa"/>
+              <w:left w:w="90" w:type="dxa"/>
+              <w:right w:w="90" w:type="dxa"/>
+            </w:tcMar>
+            <w:tcBorders>
+              <w:left w:val="nil" w:sz="0" w:color="000000"/>
+              <w:right w:val="nil" w:sz="0" w:color="000000"/>
+              <w:top w:val="nil" w:sz="0" w:color="000000"/>
+              <w:bottom w:val="nil" w:sz="0" w:color="000000"/>
+            </w:tcBorders>
+          </w:tcPr>
+          <w:p>
+            <w:pPr>
+              <w:keepNext/>
+              <w:spacing w:before="0" w:after="0" w:line="240" w:lineRule="auto"/>
+              <w:jc w:val="center"/>
+            </w:pPr>
+            <w:r/>
+            <w:r>
+              <w:rPr>
+                <w:b w:val="0"/>
+                <w:i w:val="0"/>
+                <w:sz w:val="19"/>
+              </w:rPr>
+              <w:t>0.199</w:t>
+            </w:r>
+          </w:p>
+        </w:tc>
+        <w:tc>
+          <w:tcPr>
+            <w:tcW w:type="dxa" w:w="1020"/>
+            <w:tcMar>
+              <w:top w:w="60" w:type="dxa"/>
+              <w:bottom w:w="60" w:type="dxa"/>
+              <w:left w:w="90" w:type="dxa"/>
+              <w:right w:w="90" w:type="dxa"/>
+            </w:tcMar>
+            <w:tcBorders>
+              <w:left w:val="nil" w:sz="0" w:color="000000"/>
+              <w:right w:val="nil" w:sz="0" w:color="000000"/>
+              <w:top w:val="nil" w:sz="0" w:color="000000"/>
+              <w:bottom w:val="nil" w:sz="0" w:color="000000"/>
+            </w:tcBorders>
+          </w:tcPr>
+          <w:p>
+            <w:pPr>
+              <w:keepNext/>
+              <w:spacing w:before="0" w:after="0" w:line="240" w:lineRule="auto"/>
+              <w:jc w:val="center"/>
+            </w:pPr>
+            <w:r/>
+            <w:r>
+              <w:rPr>
+                <w:b w:val="0"/>
+                <w:i w:val="0"/>
+                <w:sz w:val="19"/>
+              </w:rPr>
+              <w:t>-</w:t>
+            </w:r>
+          </w:p>
+        </w:tc>
+        <w:tc>
+          <w:tcPr>
+            <w:tcW w:type="dxa" w:w="1247"/>
+            <w:tcMar>
+              <w:top w:w="60" w:type="dxa"/>
+              <w:bottom w:w="60" w:type="dxa"/>
+              <w:left w:w="90" w:type="dxa"/>
+              <w:right w:w="90" w:type="dxa"/>
+            </w:tcMar>
+            <w:tcBorders>
+              <w:left w:val="nil" w:sz="0" w:color="000000"/>
+              <w:right w:val="nil" w:sz="0" w:color="000000"/>
+              <w:top w:val="nil" w:sz="0" w:color="000000"/>
+              <w:bottom w:val="nil" w:sz="0" w:color="000000"/>
+            </w:tcBorders>
+          </w:tcPr>
+          <w:p>
+            <w:pPr>
+              <w:keepNext/>
+              <w:spacing w:before="0" w:after="0" w:line="240" w:lineRule="auto"/>
+              <w:jc w:val="center"/>
+            </w:pPr>
+            <w:r/>
+            <w:r>
+              <w:rPr>
+                <w:b w:val="0"/>
+                <w:i w:val="0"/>
+                <w:sz w:val="19"/>
+              </w:rPr>
+              <w:t>-</w:t>
+            </w:r>
+          </w:p>
+        </w:tc>
+        <w:tc>
+          <w:tcPr>
+            <w:tcW w:type="dxa" w:w="1531"/>
+            <w:tcMar>
+              <w:top w:w="60" w:type="dxa"/>
+              <w:bottom w:w="60" w:type="dxa"/>
+              <w:left w:w="90" w:type="dxa"/>
+              <w:right w:w="90" w:type="dxa"/>
+            </w:tcMar>
+            <w:tcBorders>
+              <w:left w:val="nil" w:sz="0" w:color="000000"/>
+              <w:right w:val="nil" w:sz="0" w:color="000000"/>
+              <w:top w:val="nil" w:sz="0" w:color="000000"/>
+              <w:bottom w:val="nil" w:sz="0" w:color="000000"/>
+            </w:tcBorders>
+          </w:tcPr>
+          <w:p>
+            <w:pPr>
+              <w:keepNext/>
+              <w:spacing w:before="0" w:after="0" w:line="240" w:lineRule="auto"/>
+              <w:jc w:val="center"/>
+            </w:pPr>
+            <w:r/>
+            <w:r>
+              <w:rPr>
+                <w:b w:val="0"/>
+                <w:i w:val="0"/>
+                <w:sz w:val="19"/>
+              </w:rPr>
+              <w:t>-</w:t>
+            </w:r>
+          </w:p>
+        </w:tc>
+      </w:tr>
+      <w:tr>
+        <w:trPr>
+          <w:cantSplit/>
+        </w:trPr>
+        <w:tc>
+          <w:tcPr>
+            <w:tcW w:type="dxa" w:w="1701"/>
+            <w:tcMar>
+              <w:top w:w="60" w:type="dxa"/>
+              <w:bottom w:w="60" w:type="dxa"/>
+              <w:left w:w="90" w:type="dxa"/>
+              <w:right w:w="90" w:type="dxa"/>
+            </w:tcMar>
+            <w:tcBorders>
+              <w:left w:val="nil" w:sz="0" w:color="000000"/>
+              <w:right w:val="nil" w:sz="0" w:color="000000"/>
+              <w:top w:val="nil" w:sz="0" w:color="000000"/>
+              <w:bottom w:val="nil" w:sz="0" w:color="000000"/>
+            </w:tcBorders>
+          </w:tcPr>
+          <w:p>
+            <w:pPr>
+              <w:keepNext/>
+              <w:spacing w:before="0" w:after="0" w:line="240" w:lineRule="auto"/>
+              <w:jc w:val="left"/>
+            </w:pPr>
+            <w:r/>
+            <w:r>
+              <w:rPr>
+                <w:b w:val="0"/>
+                <w:i w:val="0"/>
+                <w:sz w:val="19"/>
+              </w:rPr>
+              <w:t>3.5, 0.9</w:t>
+            </w:r>
+          </w:p>
+        </w:tc>
+        <w:tc>
+          <w:tcPr>
+            <w:tcW w:type="dxa" w:w="907"/>
+            <w:tcMar>
+              <w:top w:w="60" w:type="dxa"/>
+              <w:bottom w:w="60" w:type="dxa"/>
+              <w:left w:w="90" w:type="dxa"/>
+              <w:right w:w="90" w:type="dxa"/>
+            </w:tcMar>
+            <w:tcBorders>
+              <w:left w:val="nil" w:sz="0" w:color="000000"/>
+              <w:right w:val="nil" w:sz="0" w:color="000000"/>
+              <w:top w:val="nil" w:sz="0" w:color="000000"/>
+              <w:bottom w:val="nil" w:sz="0" w:color="000000"/>
+            </w:tcBorders>
+          </w:tcPr>
+          <w:p>
+            <w:pPr>
+              <w:keepNext/>
+              <w:spacing w:before="0" w:after="0" w:line="240" w:lineRule="auto"/>
+              <w:jc w:val="center"/>
+            </w:pPr>
+            <w:r/>
+            <w:r>
+              <w:rPr>
+                <w:b w:val="0"/>
+                <w:i w:val="0"/>
+                <w:sz w:val="19"/>
+              </w:rPr>
+              <w:t>1.16</w:t>
+            </w:r>
+          </w:p>
+        </w:tc>
+        <w:tc>
+          <w:tcPr>
+            <w:tcW w:type="dxa" w:w="1361"/>
+            <w:tcMar>
+              <w:top w:w="60" w:type="dxa"/>
+              <w:bottom w:w="60" w:type="dxa"/>
+              <w:left w:w="90" w:type="dxa"/>
+              <w:right w:w="90" w:type="dxa"/>
+            </w:tcMar>
+            <w:tcBorders>
+              <w:left w:val="nil" w:sz="0" w:color="000000"/>
+              <w:right w:val="nil" w:sz="0" w:color="000000"/>
+              <w:top w:val="nil" w:sz="0" w:color="000000"/>
+              <w:bottom w:val="nil" w:sz="0" w:color="000000"/>
+            </w:tcBorders>
+          </w:tcPr>
+          <w:p>
+            <w:pPr>
+              <w:keepNext/>
+              <w:spacing w:before="0" w:after="0" w:line="240" w:lineRule="auto"/>
+              <w:jc w:val="center"/>
+            </w:pPr>
+            <w:r/>
+            <w:r>
+              <w:rPr>
+                <w:b w:val="0"/>
+                <w:i w:val="0"/>
+                <w:sz w:val="19"/>
+              </w:rPr>
+              <w:t>0.298</w:t>
+            </w:r>
+          </w:p>
+        </w:tc>
+        <w:tc>
+          <w:tcPr>
+            <w:tcW w:type="dxa" w:w="1020"/>
+            <w:tcMar>
+              <w:top w:w="60" w:type="dxa"/>
+              <w:bottom w:w="60" w:type="dxa"/>
+              <w:left w:w="90" w:type="dxa"/>
+              <w:right w:w="90" w:type="dxa"/>
+            </w:tcMar>
+            <w:tcBorders>
+              <w:left w:val="nil" w:sz="0" w:color="000000"/>
+              <w:right w:val="nil" w:sz="0" w:color="000000"/>
+              <w:top w:val="nil" w:sz="0" w:color="000000"/>
+              <w:bottom w:val="nil" w:sz="0" w:color="000000"/>
+            </w:tcBorders>
+          </w:tcPr>
+          <w:p>
+            <w:pPr>
+              <w:keepNext/>
+              <w:spacing w:before="0" w:after="0" w:line="240" w:lineRule="auto"/>
+              <w:jc w:val="center"/>
+            </w:pPr>
+            <w:r/>
+            <w:r>
+              <w:rPr>
+                <w:b w:val="0"/>
+                <w:i w:val="0"/>
+                <w:sz w:val="19"/>
+              </w:rPr>
+              <w:t>0.216</w:t>
+            </w:r>
+          </w:p>
+        </w:tc>
+        <w:tc>
+          <w:tcPr>
+            <w:tcW w:type="dxa" w:w="1020"/>
+            <w:tcMar>
+              <w:top w:w="60" w:type="dxa"/>
+              <w:bottom w:w="60" w:type="dxa"/>
+              <w:left w:w="90" w:type="dxa"/>
+              <w:right w:w="90" w:type="dxa"/>
+            </w:tcMar>
+            <w:tcBorders>
+              <w:left w:val="nil" w:sz="0" w:color="000000"/>
+              <w:right w:val="nil" w:sz="0" w:color="000000"/>
+              <w:top w:val="nil" w:sz="0" w:color="000000"/>
+              <w:bottom w:val="nil" w:sz="0" w:color="000000"/>
+            </w:tcBorders>
+          </w:tcPr>
+          <w:p>
+            <w:pPr>
+              <w:keepNext/>
+              <w:spacing w:before="0" w:after="0" w:line="240" w:lineRule="auto"/>
+              <w:jc w:val="center"/>
+            </w:pPr>
+            <w:r/>
+            <w:r>
+              <w:rPr>
+                <w:b w:val="0"/>
+                <w:i w:val="0"/>
+                <w:sz w:val="19"/>
+              </w:rPr>
+              <w:t>0.204</w:t>
+            </w:r>
+          </w:p>
+        </w:tc>
+        <w:tc>
+          <w:tcPr>
+            <w:tcW w:type="dxa" w:w="1247"/>
+            <w:tcMar>
+              <w:top w:w="60" w:type="dxa"/>
+              <w:bottom w:w="60" w:type="dxa"/>
+              <w:left w:w="90" w:type="dxa"/>
+              <w:right w:w="90" w:type="dxa"/>
+            </w:tcMar>
+            <w:tcBorders>
+              <w:left w:val="nil" w:sz="0" w:color="000000"/>
+              <w:right w:val="nil" w:sz="0" w:color="000000"/>
+              <w:top w:val="nil" w:sz="0" w:color="000000"/>
+              <w:bottom w:val="nil" w:sz="0" w:color="000000"/>
+            </w:tcBorders>
+          </w:tcPr>
+          <w:p>
+            <w:pPr>
+              <w:keepNext/>
+              <w:spacing w:before="0" w:after="0" w:line="240" w:lineRule="auto"/>
+              <w:jc w:val="center"/>
+            </w:pPr>
+            <w:r/>
+            <w:r>
+              <w:rPr>
+                <w:b w:val="0"/>
+                <w:i w:val="0"/>
+                <w:sz w:val="19"/>
+              </w:rPr>
+              <w:t>0.0315</w:t>
+            </w:r>
+          </w:p>
+        </w:tc>
+        <w:tc>
+          <w:tcPr>
+            <w:tcW w:type="dxa" w:w="1531"/>
+            <w:tcMar>
+              <w:top w:w="60" w:type="dxa"/>
+              <w:bottom w:w="60" w:type="dxa"/>
+              <w:left w:w="90" w:type="dxa"/>
+              <w:right w:w="90" w:type="dxa"/>
+            </w:tcMar>
+            <w:tcBorders>
+              <w:left w:val="nil" w:sz="0" w:color="000000"/>
+              <w:right w:val="nil" w:sz="0" w:color="000000"/>
+              <w:top w:val="nil" w:sz="0" w:color="000000"/>
+              <w:bottom w:val="nil" w:sz="0" w:color="000000"/>
+            </w:tcBorders>
+          </w:tcPr>
+          <w:p>
+            <w:pPr>
+              <w:keepNext/>
+              <w:spacing w:before="0" w:after="0" w:line="240" w:lineRule="auto"/>
+              <w:jc w:val="center"/>
+            </w:pPr>
+            <w:r/>
+            <w:r>
+              <w:rPr>
+                <w:b w:val="0"/>
+                <w:i w:val="0"/>
+                <w:sz w:val="19"/>
+              </w:rPr>
+              <w:t>0.027</w:t>
+            </w:r>
+          </w:p>
+        </w:tc>
+      </w:tr>
+      <w:tr>
+        <w:trPr>
+          <w:cantSplit/>
+        </w:trPr>
+        <w:tc>
+          <w:tcPr>
+            <w:tcW w:type="dxa" w:w="1701"/>
+            <w:tcMar>
+              <w:top w:w="60" w:type="dxa"/>
+              <w:bottom w:w="60" w:type="dxa"/>
+              <w:left w:w="90" w:type="dxa"/>
+              <w:right w:w="90" w:type="dxa"/>
+            </w:tcMar>
+            <w:tcBorders>
+              <w:left w:val="nil" w:sz="0" w:color="000000"/>
+              <w:right w:val="nil" w:sz="0" w:color="000000"/>
+              <w:top w:val="nil" w:sz="0" w:color="000000"/>
+              <w:bottom w:val="nil" w:sz="0" w:color="000000"/>
+            </w:tcBorders>
+          </w:tcPr>
+          <w:p>
+            <w:pPr>
+              <w:keepNext/>
+              <w:spacing w:before="0" w:after="0" w:line="240" w:lineRule="auto"/>
+              <w:jc w:val="left"/>
+            </w:pPr>
+            <w:r/>
+            <w:r>
+              <w:rPr>
+                <w:b w:val="0"/>
+                <w:i w:val="0"/>
+                <w:sz w:val="19"/>
+              </w:rPr>
+              <w:t>4, 0.9</w:t>
+            </w:r>
+          </w:p>
+        </w:tc>
+        <w:tc>
+          <w:tcPr>
+            <w:tcW w:type="dxa" w:w="907"/>
+            <w:tcMar>
+              <w:top w:w="60" w:type="dxa"/>
+              <w:bottom w:w="60" w:type="dxa"/>
+              <w:left w:w="90" w:type="dxa"/>
+              <w:right w:w="90" w:type="dxa"/>
+            </w:tcMar>
+            <w:tcBorders>
+              <w:left w:val="nil" w:sz="0" w:color="000000"/>
+              <w:right w:val="nil" w:sz="0" w:color="000000"/>
+              <w:top w:val="nil" w:sz="0" w:color="000000"/>
+              <w:bottom w:val="nil" w:sz="0" w:color="000000"/>
+            </w:tcBorders>
+          </w:tcPr>
+          <w:p>
+            <w:pPr>
+              <w:keepNext/>
+              <w:spacing w:before="0" w:after="0" w:line="240" w:lineRule="auto"/>
+              <w:jc w:val="center"/>
+            </w:pPr>
+            <w:r/>
+            <w:r>
+              <w:rPr>
+                <w:b w:val="0"/>
+                <w:i w:val="0"/>
+                <w:sz w:val="19"/>
+              </w:rPr>
+              <w:t>1.52</w:t>
+            </w:r>
+          </w:p>
+        </w:tc>
+        <w:tc>
+          <w:tcPr>
+            <w:tcW w:type="dxa" w:w="1361"/>
+            <w:tcMar>
+              <w:top w:w="60" w:type="dxa"/>
+              <w:bottom w:w="60" w:type="dxa"/>
+              <w:left w:w="90" w:type="dxa"/>
+              <w:right w:w="90" w:type="dxa"/>
+            </w:tcMar>
+            <w:tcBorders>
+              <w:left w:val="nil" w:sz="0" w:color="000000"/>
+              <w:right w:val="nil" w:sz="0" w:color="000000"/>
+              <w:top w:val="nil" w:sz="0" w:color="000000"/>
+              <w:bottom w:val="nil" w:sz="0" w:color="000000"/>
+            </w:tcBorders>
+          </w:tcPr>
+          <w:p>
+            <w:pPr>
+              <w:keepNext/>
+              <w:spacing w:before="0" w:after="0" w:line="240" w:lineRule="auto"/>
+              <w:jc w:val="center"/>
+            </w:pPr>
+            <w:r/>
+            <w:r>
+              <w:rPr>
+                <w:b w:val="0"/>
+                <w:i w:val="0"/>
+                <w:sz w:val="19"/>
+              </w:rPr>
+              <w:t>0.309</w:t>
+            </w:r>
+          </w:p>
+        </w:tc>
+        <w:tc>
+          <w:tcPr>
+            <w:tcW w:type="dxa" w:w="1020"/>
+            <w:tcMar>
+              <w:top w:w="60" w:type="dxa"/>
+              <w:bottom w:w="60" w:type="dxa"/>
+              <w:left w:w="90" w:type="dxa"/>
+              <w:right w:w="90" w:type="dxa"/>
+            </w:tcMar>
+            <w:tcBorders>
+              <w:left w:val="nil" w:sz="0" w:color="000000"/>
+              <w:right w:val="nil" w:sz="0" w:color="000000"/>
+              <w:top w:val="nil" w:sz="0" w:color="000000"/>
+              <w:bottom w:val="nil" w:sz="0" w:color="000000"/>
+            </w:tcBorders>
+          </w:tcPr>
+          <w:p>
+            <w:pPr>
+              <w:keepNext/>
+              <w:spacing w:before="0" w:after="0" w:line="240" w:lineRule="auto"/>
+              <w:jc w:val="center"/>
+            </w:pPr>
+            <w:r/>
+            <w:r>
+              <w:rPr>
+                <w:b w:val="0"/>
+                <w:i w:val="0"/>
+                <w:sz w:val="19"/>
+              </w:rPr>
+              <w:t>0.253</w:t>
+            </w:r>
+          </w:p>
+        </w:tc>
+        <w:tc>
+          <w:tcPr>
+            <w:tcW w:type="dxa" w:w="1020"/>
+            <w:tcMar>
+              <w:top w:w="60" w:type="dxa"/>
+              <w:bottom w:w="60" w:type="dxa"/>
+              <w:left w:w="90" w:type="dxa"/>
+              <w:right w:w="90" w:type="dxa"/>
+            </w:tcMar>
+            <w:tcBorders>
+              <w:left w:val="nil" w:sz="0" w:color="000000"/>
+              <w:right w:val="nil" w:sz="0" w:color="000000"/>
+              <w:top w:val="nil" w:sz="0" w:color="000000"/>
+              <w:bottom w:val="nil" w:sz="0" w:color="000000"/>
+            </w:tcBorders>
+          </w:tcPr>
+          <w:p>
+            <w:pPr>
+              <w:keepNext/>
+              <w:spacing w:before="0" w:after="0" w:line="240" w:lineRule="auto"/>
+              <w:jc w:val="center"/>
+            </w:pPr>
+            <w:r/>
+            <w:r>
+              <w:rPr>
+                <w:b w:val="0"/>
+                <w:i w:val="0"/>
+                <w:sz w:val="19"/>
+              </w:rPr>
+              <w:t>0.245</w:t>
+            </w:r>
+          </w:p>
+        </w:tc>
+        <w:tc>
+          <w:tcPr>
+            <w:tcW w:type="dxa" w:w="1247"/>
+            <w:tcMar>
+              <w:top w:w="60" w:type="dxa"/>
+              <w:bottom w:w="60" w:type="dxa"/>
+              <w:left w:w="90" w:type="dxa"/>
+              <w:right w:w="90" w:type="dxa"/>
+            </w:tcMar>
+            <w:tcBorders>
+              <w:left w:val="nil" w:sz="0" w:color="000000"/>
+              <w:right w:val="nil" w:sz="0" w:color="000000"/>
+              <w:top w:val="nil" w:sz="0" w:color="000000"/>
+              <w:bottom w:val="nil" w:sz="0" w:color="000000"/>
+            </w:tcBorders>
+          </w:tcPr>
+          <w:p>
+            <w:pPr>
+              <w:keepNext/>
+              <w:spacing w:before="0" w:after="0" w:line="240" w:lineRule="auto"/>
+              <w:jc w:val="center"/>
+            </w:pPr>
+            <w:r/>
+            <w:r>
+              <w:rPr>
+                <w:b w:val="0"/>
+                <w:i w:val="0"/>
+                <w:sz w:val="19"/>
+              </w:rPr>
+              <w:t>0.0424</w:t>
+            </w:r>
+          </w:p>
+        </w:tc>
+        <w:tc>
+          <w:tcPr>
+            <w:tcW w:type="dxa" w:w="1531"/>
+            <w:tcMar>
+              <w:top w:w="60" w:type="dxa"/>
+              <w:bottom w:w="60" w:type="dxa"/>
+              <w:left w:w="90" w:type="dxa"/>
+              <w:right w:w="90" w:type="dxa"/>
+            </w:tcMar>
+            <w:tcBorders>
+              <w:left w:val="nil" w:sz="0" w:color="000000"/>
+              <w:right w:val="nil" w:sz="0" w:color="000000"/>
+              <w:top w:val="nil" w:sz="0" w:color="000000"/>
+              <w:bottom w:val="nil" w:sz="0" w:color="000000"/>
+            </w:tcBorders>
+          </w:tcPr>
+          <w:p>
+            <w:pPr>
+              <w:keepNext/>
+              <w:spacing w:before="0" w:after="0" w:line="240" w:lineRule="auto"/>
+              <w:jc w:val="center"/>
+            </w:pPr>
+            <w:r/>
+            <w:r>
+              <w:rPr>
+                <w:b w:val="0"/>
+                <w:i w:val="0"/>
+                <w:sz w:val="19"/>
+              </w:rPr>
+              <w:t>0.028</w:t>
+            </w:r>
+          </w:p>
+        </w:tc>
+      </w:tr>
+      <w:tr>
+        <w:trPr>
+          <w:cantSplit/>
+        </w:trPr>
+        <w:tc>
+          <w:tcPr>
+            <w:tcW w:type="dxa" w:w="1701"/>
+            <w:tcMar>
+              <w:top w:w="60" w:type="dxa"/>
+              <w:bottom w:w="60" w:type="dxa"/>
+              <w:left w:w="90" w:type="dxa"/>
+              <w:right w:w="90" w:type="dxa"/>
+            </w:tcMar>
+            <w:tcBorders>
+              <w:left w:val="nil" w:sz="0" w:color="000000"/>
+              <w:right w:val="nil" w:sz="0" w:color="000000"/>
+              <w:top w:val="nil" w:sz="0" w:color="000000"/>
+              <w:bottom w:val="single" w:sz="12" w:color="000000"/>
+            </w:tcBorders>
+          </w:tcPr>
+          <w:p>
+            <w:pPr>
+              <w:keepNext w:val="0"/>
+              <w:spacing w:before="0" w:after="0" w:line="240" w:lineRule="auto"/>
+              <w:jc w:val="left"/>
+            </w:pPr>
+            <w:r/>
+            <w:r>
+              <w:rPr>
+                <w:b w:val="0"/>
+                <w:i w:val="0"/>
+                <w:sz w:val="19"/>
+              </w:rPr>
+              <w:t>3.5, 0.8</w:t>
+            </w:r>
+          </w:p>
+        </w:tc>
+        <w:tc>
+          <w:tcPr>
+            <w:tcW w:type="dxa" w:w="907"/>
+            <w:tcMar>
+              <w:top w:w="60" w:type="dxa"/>
+              <w:bottom w:w="60" w:type="dxa"/>
+              <w:left w:w="90" w:type="dxa"/>
+              <w:right w:w="90" w:type="dxa"/>
+            </w:tcMar>
+            <w:tcBorders>
+              <w:left w:val="nil" w:sz="0" w:color="000000"/>
+              <w:right w:val="nil" w:sz="0" w:color="000000"/>
+              <w:top w:val="nil" w:sz="0" w:color="000000"/>
+              <w:bottom w:val="single" w:sz="12" w:color="000000"/>
+            </w:tcBorders>
+          </w:tcPr>
+          <w:p>
+            <w:pPr>
+              <w:keepNext w:val="0"/>
+              <w:spacing w:before="0" w:after="0" w:line="240" w:lineRule="auto"/>
+              <w:jc w:val="center"/>
+            </w:pPr>
+            <w:r/>
+            <w:r>
+              <w:rPr>
+                <w:b w:val="0"/>
+                <w:i w:val="0"/>
+                <w:sz w:val="19"/>
+              </w:rPr>
+              <w:t>2.21</w:t>
+            </w:r>
+          </w:p>
+        </w:tc>
+        <w:tc>
+          <w:tcPr>
+            <w:tcW w:type="dxa" w:w="1361"/>
+            <w:tcMar>
+              <w:top w:w="60" w:type="dxa"/>
+              <w:bottom w:w="60" w:type="dxa"/>
+              <w:left w:w="90" w:type="dxa"/>
+              <w:right w:w="90" w:type="dxa"/>
+            </w:tcMar>
+            <w:tcBorders>
+              <w:left w:val="nil" w:sz="0" w:color="000000"/>
+              <w:right w:val="nil" w:sz="0" w:color="000000"/>
+              <w:top w:val="nil" w:sz="0" w:color="000000"/>
+              <w:bottom w:val="single" w:sz="12" w:color="000000"/>
+            </w:tcBorders>
+          </w:tcPr>
+          <w:p>
+            <w:pPr>
+              <w:keepNext w:val="0"/>
+              <w:spacing w:before="0" w:after="0" w:line="240" w:lineRule="auto"/>
+              <w:jc w:val="center"/>
+            </w:pPr>
+            <w:r/>
+            <w:r>
+              <w:rPr>
+                <w:b w:val="0"/>
+                <w:i w:val="0"/>
+                <w:sz w:val="19"/>
+              </w:rPr>
+              <w:t>0.386</w:t>
+            </w:r>
+          </w:p>
+        </w:tc>
+        <w:tc>
+          <w:tcPr>
+            <w:tcW w:type="dxa" w:w="1020"/>
+            <w:tcMar>
+              <w:top w:w="60" w:type="dxa"/>
+              <w:bottom w:w="60" w:type="dxa"/>
+              <w:left w:w="90" w:type="dxa"/>
+              <w:right w:w="90" w:type="dxa"/>
+            </w:tcMar>
+            <w:tcBorders>
+              <w:left w:val="nil" w:sz="0" w:color="000000"/>
+              <w:right w:val="nil" w:sz="0" w:color="000000"/>
+              <w:top w:val="nil" w:sz="0" w:color="000000"/>
+              <w:bottom w:val="single" w:sz="12" w:color="000000"/>
+            </w:tcBorders>
+          </w:tcPr>
+          <w:p>
+            <w:pPr>
+              <w:keepNext w:val="0"/>
+              <w:spacing w:before="0" w:after="0" w:line="240" w:lineRule="auto"/>
+              <w:jc w:val="center"/>
+            </w:pPr>
+            <w:r/>
+            <w:r>
+              <w:rPr>
+                <w:b w:val="0"/>
+                <w:i w:val="0"/>
+                <w:sz w:val="19"/>
+              </w:rPr>
+              <w:t>0.332</w:t>
+            </w:r>
+          </w:p>
+        </w:tc>
+        <w:tc>
+          <w:tcPr>
+            <w:tcW w:type="dxa" w:w="1020"/>
+            <w:tcMar>
+              <w:top w:w="60" w:type="dxa"/>
+              <w:bottom w:w="60" w:type="dxa"/>
+              <w:left w:w="90" w:type="dxa"/>
+              <w:right w:w="90" w:type="dxa"/>
+            </w:tcMar>
+            <w:tcBorders>
+              <w:left w:val="nil" w:sz="0" w:color="000000"/>
+              <w:right w:val="nil" w:sz="0" w:color="000000"/>
+              <w:top w:val="nil" w:sz="0" w:color="000000"/>
+              <w:bottom w:val="single" w:sz="12" w:color="000000"/>
+            </w:tcBorders>
+          </w:tcPr>
+          <w:p>
+            <w:pPr>
+              <w:keepNext w:val="0"/>
+              <w:spacing w:before="0" w:after="0" w:line="240" w:lineRule="auto"/>
+              <w:jc w:val="center"/>
+            </w:pPr>
+            <w:r/>
+            <w:r>
+              <w:rPr>
+                <w:b w:val="0"/>
+                <w:i w:val="0"/>
+                <w:sz w:val="19"/>
+              </w:rPr>
+              <w:t>0.324</w:t>
+            </w:r>
+          </w:p>
+        </w:tc>
+        <w:tc>
+          <w:tcPr>
+            <w:tcW w:type="dxa" w:w="1247"/>
+            <w:tcMar>
+              <w:top w:w="60" w:type="dxa"/>
+              <w:bottom w:w="60" w:type="dxa"/>
+              <w:left w:w="90" w:type="dxa"/>
+              <w:right w:w="90" w:type="dxa"/>
+            </w:tcMar>
+            <w:tcBorders>
+              <w:left w:val="nil" w:sz="0" w:color="000000"/>
+              <w:right w:val="nil" w:sz="0" w:color="000000"/>
+              <w:top w:val="nil" w:sz="0" w:color="000000"/>
+              <w:bottom w:val="single" w:sz="12" w:color="000000"/>
+            </w:tcBorders>
+          </w:tcPr>
+          <w:p>
+            <w:pPr>
+              <w:keepNext w:val="0"/>
+              <w:spacing w:before="0" w:after="0" w:line="240" w:lineRule="auto"/>
+              <w:jc w:val="center"/>
+            </w:pPr>
+            <w:r/>
+            <w:r>
+              <w:rPr>
+                <w:b w:val="0"/>
+                <w:i w:val="0"/>
+                <w:sz w:val="19"/>
+              </w:rPr>
+              <w:t>0.0586</w:t>
+            </w:r>
+          </w:p>
+        </w:tc>
+        <w:tc>
+          <w:tcPr>
+            <w:tcW w:type="dxa" w:w="1531"/>
+            <w:tcMar>
+              <w:top w:w="60" w:type="dxa"/>
+              <w:bottom w:w="60" w:type="dxa"/>
+              <w:left w:w="90" w:type="dxa"/>
+              <w:right w:w="90" w:type="dxa"/>
+            </w:tcMar>
+            <w:tcBorders>
+              <w:left w:val="nil" w:sz="0" w:color="000000"/>
+              <w:right w:val="nil" w:sz="0" w:color="000000"/>
+              <w:top w:val="nil" w:sz="0" w:color="000000"/>
+              <w:bottom w:val="single" w:sz="12" w:color="000000"/>
+            </w:tcBorders>
+          </w:tcPr>
+          <w:p>
+            <w:pPr>
+              <w:keepNext w:val="0"/>
+              <w:spacing w:before="0" w:after="0" w:line="240" w:lineRule="auto"/>
+              <w:jc w:val="center"/>
+            </w:pPr>
+            <w:r/>
+            <w:r>
+              <w:rPr>
+                <w:b w:val="0"/>
+                <w:i w:val="0"/>
+                <w:sz w:val="19"/>
+              </w:rPr>
+              <w:t>0.027</w:t>
+            </w:r>
+          </w:p>
+        </w:tc>
+      </w:tr>
+    </w:tbl>
+    <w:p>
+      <w:pPr>
+        <w:spacing w:after="200"/>
+      </w:pPr>
+    </w:p>
+    <w:p>
+      <w:pPr>
+        <w:sectPr>
+          <w:type w:val="continuous"/>
+          <w:pgSz w:w="11906" w:h="16838"/>
+          <w:pgMar w:top="1304" w:right="1247" w:bottom="1304" w:left="1247" w:header="720" w:footer="720" w:gutter="0"/>
+          <w:docGrid w:linePitch="360"/>
+          <w:cols w:num="1" w:space="453"/>
+        </w:sectPr>
+      </w:pPr>
+    </w:p>
+    <w:p>
+      <w:pPr>
         <w:pStyle w:val="Heading1"/>
       </w:pPr>
       <w:r>
@@ -4782,7 +4847,22 @@
           <w:b w:val="0"/>
           <w:i w:val="0"/>
         </w:rPr>
-        <w:t>The trade-off follows from two properties that do not depend on the numerical details: a shock-parallel field is not compressed by the shock, and magnetic tension does not resist shear along the field. Any stripe pattern strong enough to redirect the post-shock flow therefore also drives the shear that deforms the interface. A field that locks the interface must be nearly uniform, and a field that collimates the flow cannot lock it. Phase alignment can choose the time at which the seeded mode is flat but cannot hold it there.</w:t>
+        <w:t>The trade-off follows from two properties that do not depend on the numerical details: a shock-parallel field is not compressed by the shock, and magnetic tension does not resist shear along the field. Any stripe pattern strong enough to redirect the post-shock flow therefore also drives the shear that deforms the interface, and the converged deformation grows in proportion to the contrast (a₈ = κΔP</w:t>
+      </w:r>
+      <w:r>
+        <w:rPr>
+          <w:b w:val="0"/>
+          <w:i w:val="0"/>
+          <w:vertAlign w:val="subscript"/>
+        </w:rPr>
+        <w:t>B</w:t>
+      </w:r>
+      <w:r>
+        <w:rPr>
+          <w:b w:val="0"/>
+          <w:i w:val="0"/>
+        </w:rPr>
+        <w:t>). A field that leaves the interface as smooth as a uniform field must be nearly uniform, and a field that collimates the flow cannot do so. Phase alignment can choose the time at which the seeded mode is flat but cannot hold it there.</w:t>
       </w:r>
     </w:p>
     <w:p>
@@ -4802,7 +4882,19 @@
           <w:b w:val="0"/>
           <w:i w:val="0"/>
         </w:rPr>
-        <w:t>The results apply to two-dimensional ideal MHD with shock-parallel stripes, uniform upstream density, Mach 10, density ratio 3 and the fast-shock regime of Eq. (3). Stronger fields with switch-on shocks, three-dimensional flow, other closures and oblique fields were not examined. Most sweeps used one resolution and one realisation, and Section 4.6 shows that deep-stripe metrics depend on resolution; the 10% lock boundary and the zero-crossing times need a convergence study before quantitative use. Divergence errors of a few percent remain at shocks because the scheme does not use constrained transport.</w:t>
+        <w:t>The results apply to ideal MHD with shock-parallel stripes, uniform upstream density, Mach 10, density ratio 3 and the fast-shock regime of Eq. (3); stronger fields with switch-on shocks, other closures and oblique fields were not examined. The convergence study covered the cases nearest the former boundary at three resolutions, but the uniform-field reference was not run at the finest grid, the other sweeps used one resolution, and all used one realisation; the zero-crossing times in particular are base-resolution values. Thresholds based on enstrophy would need a viscous treatment in which enstrophy converges. Divergence errors of a few percent remain at shocks because the scheme does not use constrained transport.</w:t>
+      </w:r>
+    </w:p>
+    <w:p>
+      <w:pPr>
+        <w:jc w:val="both"/>
+      </w:pPr>
+      <w:r>
+        <w:rPr>
+          <w:b w:val="0"/>
+          <w:i w:val="0"/>
+        </w:rPr>
+        <w:t>A three-dimensional extension of the solver (verified against the two-dimensional solver to 10⁻¹⁴ for z-invariant states) was used to ask whether the field-aligned shear layers break down through secondary Kelvin-Helmholtz or tearing instabilities. With explicit resistivity at the largest Lundquist number the grid resolves (S ≈ 75), field-reversing stripes and a frame moving with the interface to t = 5, the seeded three-dimensional runs were indistinguishable from their z-invariant controls: the z-velocity decayed, the current sheets stayed z-uniform and did not tear. Tearing at plasma-like S ≥ 10³ remains untested.</w:t>
       </w:r>
     </w:p>
     <w:p>
@@ -4822,7 +4914,22 @@
           <w:b w:val="0"/>
           <w:i w:val="0"/>
         </w:rPr>
-        <w:t>Deep magnetic stripes cannot both hold a shocked interface and channel the flow through their gaps when the field is shock-parallel and the shock is in the fast regime. Reaching this result required correcting the initial field, the upstream equilibrium, the resistive energy term and the energy diagnostic, and restricting initial states to admissible shocks. A uniform field locks the interface; stripes lock only at about 10% contrast; larger contrast creates a field-aligned shear that tension cannot oppose, so suppression and collimation compete. Phase-aligned stripes produce a zero crossing of the seeded mode at a time set by the contrast, the magnetic analogue of known hydrodynamic phase interference, but no sustained lock.</w:t>
+        <w:t>Deep magnetic stripes cannot both hold a shocked interface and channel the flow through their gaps when the field is shock-parallel and the shock is in the fast regime. Reaching this result required correcting the initial field, the upstream equilibrium, the resistive energy term and the energy diagnostic, and restricting initial states to admissible shocks. A uniform field suppresses the instability; stripes create a field-aligned shear that tension cannot oppose, and the resulting stripe-scale deformation of the interface grows linearly with the bar-gap magnetic-pressure contrast, converged over three resolutions to a₈ ≈ 0.028 ΔP</w:t>
+      </w:r>
+      <w:r>
+        <w:rPr>
+          <w:b w:val="0"/>
+          <w:i w:val="0"/>
+          <w:vertAlign w:val="subscript"/>
+        </w:rPr>
+        <w:t>B</w:t>
+      </w:r>
+      <w:r>
+        <w:rPr>
+          <w:b w:val="0"/>
+          <w:i w:val="0"/>
+        </w:rPr>
+        <w:t>. Suppression and collimation therefore compete. Phase-aligned stripes produce a zero crossing of the seeded mode at a time set by the contrast, the magnetic analogue of known hydrodynamic phase interference, but no sustained lock. A lock threshold measured by enstrophy relative to the hydrodynamic case is not a converged quantity in inviscid simulations and should not be used to compare magnetized and unmagnetized runs.</w:t>
       </w:r>
     </w:p>
     <w:p>
@@ -4842,7 +4949,7 @@
           <w:b w:val="0"/>
           <w:i w:val="0"/>
         </w:rPr>
-        <w:t>The solver, sweeps A-H, saved time series and the scripts that generate the figures and this document are available at [repository URL].</w:t>
+        <w:t>The solver, sweeps A-H, the convergence study, the three-dimensional sweeps, saved time series and the scripts that generate the figures and this document are available at [repository URL].</w:t>
       </w:r>
     </w:p>
     <w:p>

</xml_diff>

<commit_message>
4x uniform-field reference; repository URL and acknowledgements
Uniform B = 3 at 1600 x 400: roughness 0.0178 (0.127 of hydro), a8 =
0.0026 (a8/dP_B = 0.029, on the linear law). The uniform roughness is
still decreasing (0.0269, 0.0208, 0.0178), so the stripe excess over the
uniform field widens with resolution (1.1-1.4x -> 1.6-2.5x); Table 2,
Section 4.6, Fig. 13 and the limitations updated to say so.
convergence_lock.py: --cases/--merge (append to saved results) and a CSV
export to results/convergence/convergence_summary.csv.
Paper: repository URL, acknowledgements. CITATION.cff and pyproject.toml
carry the repository URL.

Co-Authored-By: Claude Opus 5.5 <noreply@anthropic.com>
</commit_message>
<xml_diff>
--- a/paper/magnetic_sieve.docx
+++ b/paper/magnetic_sieve.docx
@@ -3152,7 +3152,7 @@
           <w:b w:val="0"/>
           <w:i w:val="0"/>
         </w:rPr>
-        <w:t>The interface roughness does converge. The hydrodynamic value changes from 0.132 to 0.140 between the two finest grids, and the striped values by at most 4%; relative to the hydrodynamic run they settle at 0.20, 0.25 and 0.32 for increasing contrast. The stripe-scale mode is proportional to the magnetic-pressure contrast at every resolution, a₈ = κΔP</w:t>
+        <w:t>The interface roughness of the hydrodynamic and striped runs converges. The hydrodynamic value changes from 0.132 to 0.140 between the two finest grids, and the striped values by at most 4%; relative to the hydrodynamic run they settle at 0.20, 0.25 and 0.32 for increasing contrast. The uniform field is the exception: its roughness keeps decreasing (0.0269, 0.0208, 0.0178, roughly first order), so the excess roughness of the stripes over a uniform field widens with resolution, from 1.1-1.4 times at the base grid to 1.6-2.5 times at the finest. The stripe-scale mode is proportional to the magnetic-pressure contrast at every resolution, a₈ = κΔP</w:t>
       </w:r>
       <w:r>
         <w:rPr>
@@ -3167,7 +3167,37 @@
           <w:b w:val="0"/>
           <w:i w:val="0"/>
         </w:rPr>
-        <w:t>, with κ = 0.0176, 0.0250 and 0.0270 at the three grids. Richardson extrapolation of κ (observed order 1.9) gives κ ≈ 0.028. This linear law, not a threshold, is the converged statement of the trade-off: the interface deformation produced by the stripes scales with the contrast that makes them collimate.</w:t>
+        <w:t>, with κ = 0.0176, 0.0250 and 0.0270 at the three grids. Richardson extrapolation of κ (observed order 1.9) gives κ ≈ 0.028, and even the small residual a₈ of the nearly uniform field (ε = 0.99, ΔP</w:t>
+      </w:r>
+      <w:r>
+        <w:rPr>
+          <w:b w:val="0"/>
+          <w:i w:val="0"/>
+          <w:vertAlign w:val="subscript"/>
+        </w:rPr>
+        <w:t>B</w:t>
+      </w:r>
+      <w:r>
+        <w:rPr>
+          <w:b w:val="0"/>
+          <w:i w:val="0"/>
+        </w:rPr>
+        <w:t xml:space="preserve"> = 0.09) follows it, with a₈/ΔP</w:t>
+      </w:r>
+      <w:r>
+        <w:rPr>
+          <w:b w:val="0"/>
+          <w:i w:val="0"/>
+          <w:vertAlign w:val="subscript"/>
+        </w:rPr>
+        <w:t>B</w:t>
+      </w:r>
+      <w:r>
+        <w:rPr>
+          <w:b w:val="0"/>
+          <w:i w:val="0"/>
+        </w:rPr>
+        <w:t xml:space="preserve"> = 0.029. This linear law, not a threshold, is the converged statement of the trade-off: the interface deformation produced by the stripes scales with the contrast that makes them collimate.</w:t>
       </w:r>
     </w:p>
     <w:p>
@@ -3251,7 +3281,7 @@
           <w:i w:val="0"/>
           <w:sz w:val="18"/>
         </w:rPr>
-        <w:t xml:space="preserve"> at each resolution. The uniform field and B₀ = 3 were not run at 4×.</w:t>
+        <w:t xml:space="preserve"> at each resolution. B₀ = 3 was not run at 4×.</w:t>
       </w:r>
     </w:p>
     <w:p>
@@ -3758,7 +3788,7 @@
                 <w:i w:val="0"/>
                 <w:sz w:val="19"/>
               </w:rPr>
-              <w:t>-</w:t>
+              <w:t>0.127</w:t>
             </w:r>
           </w:p>
         </w:tc>
@@ -3791,7 +3821,7 @@
                 <w:i w:val="0"/>
                 <w:sz w:val="19"/>
               </w:rPr>
-              <w:t>-</w:t>
+              <w:t>0.0026</w:t>
             </w:r>
           </w:p>
         </w:tc>
@@ -3824,7 +3854,7 @@
                 <w:i w:val="0"/>
                 <w:sz w:val="19"/>
               </w:rPr>
-              <w:t>-</w:t>
+              <w:t>0.029</w:t>
             </w:r>
           </w:p>
         </w:tc>
@@ -4882,7 +4912,7 @@
           <w:b w:val="0"/>
           <w:i w:val="0"/>
         </w:rPr>
-        <w:t>The results apply to ideal MHD with shock-parallel stripes, uniform upstream density, Mach 10, density ratio 3 and the fast-shock regime of Eq. (3); stronger fields with switch-on shocks, other closures and oblique fields were not examined. The convergence study covered the cases nearest the former boundary at three resolutions, but the uniform-field reference was not run at the finest grid, the other sweeps used one resolution, and all used one realisation; the zero-crossing times in particular are base-resolution values. Thresholds based on enstrophy would need a viscous treatment in which enstrophy converges. Divergence errors of a few percent remain at shocks because the scheme does not use constrained transport.</w:t>
+        <w:t>The results apply to ideal MHD with shock-parallel stripes, uniform upstream density, Mach 10, density ratio 3 and the fast-shock regime of Eq. (3); stronger fields with switch-on shocks, other closures and oblique fields were not examined. The convergence study covered the cases nearest the former boundary at three resolutions, but the uniform-field roughness was still decreasing at the finest grid, the other sweeps used one resolution, and all used one realisation; the zero-crossing times in particular are base-resolution values. Thresholds based on enstrophy would need a viscous treatment in which enstrophy converges. Divergence errors of a few percent remain at shocks because the scheme does not use constrained transport.</w:t>
       </w:r>
     </w:p>
     <w:p>
@@ -4942,14 +4972,14 @@
     </w:p>
     <w:p>
       <w:pPr>
-        <w:jc w:val="both"/>
+        <w:jc w:val="left"/>
       </w:pPr>
       <w:r>
         <w:rPr>
           <w:b w:val="0"/>
           <w:i w:val="0"/>
         </w:rPr>
-        <w:t>The solver, sweeps A-H, the convergence study, the three-dimensional sweeps, saved time series and the scripts that generate the figures and this document are available at [repository URL].</w:t>
+        <w:t>The solver, sweeps A-H, the convergence study, the three-dimensional sweeps, saved time series and the scripts that generate the figures and this document are available at https://github.com/Semedo2002/MagSieve-3D.</w:t>
       </w:r>
     </w:p>
     <w:p>
@@ -4969,7 +4999,7 @@
           <w:b w:val="0"/>
           <w:i w:val="0"/>
         </w:rPr>
-        <w:t>[Computing resources, and any disclosure of tools used, as required by the target venue.]</w:t>
+        <w:t>The author thanks Professor Emeritus Kenneth Morgan (Swansea University) for sharing his work, which has led the way towards a better future for computational fluid dynamics and computational engineering, and for a mentorship that continued long beyond the author's time at Swansea University and into his retirement. All simulations were run on the author's own workstation with a single NVIDIA GPU.</w:t>
       </w:r>
     </w:p>
     <w:p>

</xml_diff>